<commit_message>
Modificación CU portal de inicio
</commit_message>
<xml_diff>
--- a/Casos de Uso/CU-00-Portal de Inicio v1.docx
+++ b/Casos de Uso/CU-00-Portal de Inicio v1.docx
@@ -1,10 +1,10 @@
 
 <file path=word/document.xml><?xml version="1.0" encoding="utf-8"?>
-<w:document xmlns:wpc="http://schemas.microsoft.com/office/word/2010/wordprocessingCanvas" xmlns:cx="http://schemas.microsoft.com/office/drawing/2014/chartex" xmlns:cx1="http://schemas.microsoft.com/office/drawing/2015/9/8/chartex" xmlns:cx2="http://schemas.microsoft.com/office/drawing/2015/10/21/chartex" xmlns:cx3="http://schemas.microsoft.com/office/drawing/2016/5/9/chartex" xmlns:cx4="http://schemas.microsoft.com/office/drawing/2016/5/10/chartex" xmlns:cx5="http://schemas.microsoft.com/office/drawing/2016/5/11/chartex" xmlns:cx6="http://schemas.microsoft.com/office/drawing/2016/5/12/chartex" xmlns:cx7="http://schemas.microsoft.com/office/drawing/2016/5/13/chartex" xmlns:cx8="http://schemas.microsoft.com/office/drawing/2016/5/14/chartex" xmlns:mc="http://schemas.openxmlformats.org/markup-compatibility/2006" xmlns:aink="http://schemas.microsoft.com/office/drawing/2016/ink" xmlns:am3d="http://schemas.microsoft.com/office/drawing/2017/model3d" xmlns:o="urn:schemas-microsoft-com:office:office" xmlns:oel="http://schemas.microsoft.com/office/2019/extlst" xmlns:r="http://schemas.openxmlformats.org/officeDocument/2006/relationships" xmlns:m="http://schemas.openxmlformats.org/officeDocument/2006/math" xmlns:v="urn:schemas-microsoft-com:vml" xmlns:wp14="http://schemas.microsoft.com/office/word/2010/wordprocessingDrawing" xmlns:wp="http://schemas.openxmlformats.org/drawingml/2006/wordprocessingDrawing" xmlns:w10="urn:schemas-microsoft-com:office:word" xmlns:w="http://schemas.openxmlformats.org/wordprocessingml/2006/main" xmlns:w14="http://schemas.microsoft.com/office/word/2010/wordml" xmlns:w15="http://schemas.microsoft.com/office/word/2012/wordml" xmlns:w16cex="http://schemas.microsoft.com/office/word/2018/wordml/cex" xmlns:w16cid="http://schemas.microsoft.com/office/word/2016/wordml/cid" xmlns:w16="http://schemas.microsoft.com/office/word/2018/wordml" xmlns:w16du="http://schemas.microsoft.com/office/word/2023/wordml/word16du" xmlns:w16sdtdh="http://schemas.microsoft.com/office/word/2020/wordml/sdtdatahash" xmlns:w16sdtfl="http://schemas.microsoft.com/office/word/2024/wordml/sdtformatlock" xmlns:w16se="http://schemas.microsoft.com/office/word/2015/wordml/symex" xmlns:wpg="http://schemas.microsoft.com/office/word/2010/wordprocessingGroup" xmlns:wpi="http://schemas.microsoft.com/office/word/2010/wordprocessingInk" xmlns:wne="http://schemas.microsoft.com/office/word/2006/wordml" xmlns:wps="http://schemas.microsoft.com/office/word/2010/wordprocessingShape" mc:Ignorable="w14 w15 w16se w16cid w16 w16cex w16sdtdh w16sdtfl w16du wp14">
+<w:document xmlns:wpc="http://schemas.microsoft.com/office/word/2010/wordprocessingCanvas" xmlns:cx="http://schemas.microsoft.com/office/drawing/2014/chartex" xmlns:cx1="http://schemas.microsoft.com/office/drawing/2015/9/8/chartex" xmlns:cx2="http://schemas.microsoft.com/office/drawing/2015/10/21/chartex" xmlns:cx3="http://schemas.microsoft.com/office/drawing/2016/5/9/chartex" xmlns:cx4="http://schemas.microsoft.com/office/drawing/2016/5/10/chartex" xmlns:cx5="http://schemas.microsoft.com/office/drawing/2016/5/11/chartex" xmlns:cx6="http://schemas.microsoft.com/office/drawing/2016/5/12/chartex" xmlns:cx7="http://schemas.microsoft.com/office/drawing/2016/5/13/chartex" xmlns:cx8="http://schemas.microsoft.com/office/drawing/2016/5/14/chartex" xmlns:mc="http://schemas.openxmlformats.org/markup-compatibility/2006" xmlns:aink="http://schemas.microsoft.com/office/drawing/2016/ink" xmlns:am3d="http://schemas.microsoft.com/office/drawing/2017/model3d" xmlns:o="urn:schemas-microsoft-com:office:office" xmlns:r="http://schemas.openxmlformats.org/officeDocument/2006/relationships" xmlns:m="http://schemas.openxmlformats.org/officeDocument/2006/math" xmlns:v="urn:schemas-microsoft-com:vml" xmlns:wp14="http://schemas.microsoft.com/office/word/2010/wordprocessingDrawing" xmlns:wp="http://schemas.openxmlformats.org/drawingml/2006/wordprocessingDrawing" xmlns:w10="urn:schemas-microsoft-com:office:word" xmlns:w="http://schemas.openxmlformats.org/wordprocessingml/2006/main" xmlns:w14="http://schemas.microsoft.com/office/word/2010/wordml" xmlns:w15="http://schemas.microsoft.com/office/word/2012/wordml" xmlns:w16cex="http://schemas.microsoft.com/office/word/2018/wordml/cex" xmlns:w16cid="http://schemas.microsoft.com/office/word/2016/wordml/cid" xmlns:w16="http://schemas.microsoft.com/office/word/2018/wordml" xmlns:w16sdtdh="http://schemas.microsoft.com/office/word/2020/wordml/sdtdatahash" xmlns:w16se="http://schemas.microsoft.com/office/word/2015/wordml/symex" xmlns:wpg="http://schemas.microsoft.com/office/word/2010/wordprocessingGroup" xmlns:wpi="http://schemas.microsoft.com/office/word/2010/wordprocessingInk" xmlns:wne="http://schemas.microsoft.com/office/word/2006/wordml" xmlns:wps="http://schemas.microsoft.com/office/word/2010/wordprocessingShape" mc:Ignorable="w14 w15 w16se w16cid w16 w16cex w16sdtdh wp14">
   <w:body>
     <w:p>
       <w:pPr>
-        <w:pStyle w:val="Ttulo"/>
+        <w:pStyle w:val="Title"/>
         <w:spacing w:after="0"/>
         <w:jc w:val="right"/>
         <w:rPr>
@@ -28,7 +28,7 @@
     </w:p>
     <w:p>
       <w:pPr>
-        <w:pStyle w:val="Ttulo"/>
+        <w:pStyle w:val="Title"/>
         <w:spacing w:after="0"/>
         <w:jc w:val="right"/>
         <w:rPr>
@@ -186,12 +186,12 @@
       <w:tblPr>
         <w:tblW w:w="5000" w:type="pct"/>
         <w:tblBorders>
-          <w:top w:val="single" w:color="auto" w:sz="12" w:space="0"/>
-          <w:left w:val="single" w:color="auto" w:sz="12" w:space="0"/>
-          <w:bottom w:val="single" w:color="auto" w:sz="12" w:space="0"/>
-          <w:right w:val="single" w:color="auto" w:sz="12" w:space="0"/>
-          <w:insideH w:val="single" w:color="auto" w:sz="6" w:space="0"/>
-          <w:insideV w:val="single" w:color="auto" w:sz="6" w:space="0"/>
+          <w:top w:val="single" w:sz="12" w:space="0" w:color="auto"/>
+          <w:left w:val="single" w:sz="12" w:space="0" w:color="auto"/>
+          <w:bottom w:val="single" w:sz="12" w:space="0" w:color="auto"/>
+          <w:right w:val="single" w:sz="12" w:space="0" w:color="auto"/>
+          <w:insideH w:val="single" w:sz="6" w:space="0" w:color="auto"/>
+          <w:insideV w:val="single" w:sz="6" w:space="0" w:color="auto"/>
         </w:tblBorders>
         <w:tblLook w:val="0000" w:firstRow="0" w:lastRow="0" w:firstColumn="0" w:lastColumn="0" w:noHBand="0" w:noVBand="0"/>
       </w:tblPr>
@@ -206,11 +206,10 @@
           <w:tcPr>
             <w:tcW w:w="1705" w:type="pct"/>
             <w:tcBorders>
-              <w:top w:val="thinThickSmallGap" w:color="auto" w:sz="24" w:space="0"/>
-              <w:left w:val="thinThickSmallGap" w:color="auto" w:sz="24" w:space="0"/>
-              <w:bottom w:val="thickThinSmallGap" w:color="auto" w:sz="24" w:space="0"/>
+              <w:top w:val="thinThickSmallGap" w:sz="24" w:space="0" w:color="auto"/>
+              <w:left w:val="thinThickSmallGap" w:sz="24" w:space="0" w:color="auto"/>
+              <w:bottom w:val="thickThinSmallGap" w:sz="24" w:space="0" w:color="auto"/>
             </w:tcBorders>
-            <w:tcMar/>
           </w:tcPr>
           <w:p>
             <w:pPr>
@@ -236,10 +235,9 @@
           <w:tcPr>
             <w:tcW w:w="693" w:type="pct"/>
             <w:tcBorders>
-              <w:top w:val="thinThickSmallGap" w:color="auto" w:sz="24" w:space="0"/>
-              <w:bottom w:val="thickThinSmallGap" w:color="auto" w:sz="24" w:space="0"/>
+              <w:top w:val="thinThickSmallGap" w:sz="24" w:space="0" w:color="auto"/>
+              <w:bottom w:val="thickThinSmallGap" w:sz="24" w:space="0" w:color="auto"/>
             </w:tcBorders>
-            <w:tcMar/>
           </w:tcPr>
           <w:p>
             <w:pPr>
@@ -265,10 +263,9 @@
           <w:tcPr>
             <w:tcW w:w="2044" w:type="pct"/>
             <w:tcBorders>
-              <w:top w:val="thinThickSmallGap" w:color="auto" w:sz="24" w:space="0"/>
-              <w:bottom w:val="thickThinSmallGap" w:color="auto" w:sz="24" w:space="0"/>
+              <w:top w:val="thinThickSmallGap" w:sz="24" w:space="0" w:color="auto"/>
+              <w:bottom w:val="thickThinSmallGap" w:sz="24" w:space="0" w:color="auto"/>
             </w:tcBorders>
-            <w:tcMar/>
           </w:tcPr>
           <w:p>
             <w:pPr>
@@ -302,11 +299,10 @@
           <w:tcPr>
             <w:tcW w:w="559" w:type="pct"/>
             <w:tcBorders>
-              <w:top w:val="thinThickSmallGap" w:color="auto" w:sz="24" w:space="0"/>
-              <w:bottom w:val="thickThinSmallGap" w:color="auto" w:sz="24" w:space="0"/>
-              <w:right w:val="thickThinSmallGap" w:color="auto" w:sz="24" w:space="0"/>
+              <w:top w:val="thinThickSmallGap" w:sz="24" w:space="0" w:color="auto"/>
+              <w:bottom w:val="thickThinSmallGap" w:sz="24" w:space="0" w:color="auto"/>
+              <w:right w:val="thickThinSmallGap" w:sz="24" w:space="0" w:color="auto"/>
             </w:tcBorders>
-            <w:tcMar/>
           </w:tcPr>
           <w:p>
             <w:pPr>
@@ -350,11 +346,10 @@
           <w:tcPr>
             <w:tcW w:w="1705" w:type="pct"/>
             <w:tcBorders>
-              <w:top w:val="thickThinSmallGap" w:color="auto" w:sz="24" w:space="0"/>
-              <w:left w:val="thinThickSmallGap" w:color="auto" w:sz="24" w:space="0"/>
-              <w:bottom w:val="single" w:color="auto" w:sz="6" w:space="0"/>
+              <w:top w:val="thickThinSmallGap" w:sz="24" w:space="0" w:color="auto"/>
+              <w:left w:val="thinThickSmallGap" w:sz="24" w:space="0" w:color="auto"/>
+              <w:bottom w:val="single" w:sz="6" w:space="0" w:color="auto"/>
             </w:tcBorders>
-            <w:tcMar/>
           </w:tcPr>
           <w:p>
             <w:pPr>
@@ -391,10 +386,9 @@
           <w:tcPr>
             <w:tcW w:w="693" w:type="pct"/>
             <w:tcBorders>
-              <w:top w:val="thickThinSmallGap" w:color="auto" w:sz="24" w:space="0"/>
-              <w:bottom w:val="single" w:color="auto" w:sz="6" w:space="0"/>
+              <w:top w:val="thickThinSmallGap" w:sz="24" w:space="0" w:color="auto"/>
+              <w:bottom w:val="single" w:sz="6" w:space="0" w:color="auto"/>
             </w:tcBorders>
-            <w:tcMar/>
           </w:tcPr>
           <w:p>
             <w:pPr>
@@ -417,10 +411,9 @@
           <w:tcPr>
             <w:tcW w:w="2044" w:type="pct"/>
             <w:tcBorders>
-              <w:top w:val="thickThinSmallGap" w:color="auto" w:sz="24" w:space="0"/>
-              <w:bottom w:val="single" w:color="auto" w:sz="6" w:space="0"/>
+              <w:top w:val="thickThinSmallGap" w:sz="24" w:space="0" w:color="auto"/>
+              <w:bottom w:val="single" w:sz="6" w:space="0" w:color="auto"/>
             </w:tcBorders>
-            <w:tcMar/>
           </w:tcPr>
           <w:p>
             <w:pPr>
@@ -443,11 +436,10 @@
           <w:tcPr>
             <w:tcW w:w="559" w:type="pct"/>
             <w:tcBorders>
-              <w:top w:val="thickThinSmallGap" w:color="auto" w:sz="24" w:space="0"/>
-              <w:bottom w:val="single" w:color="auto" w:sz="6" w:space="0"/>
-              <w:right w:val="thickThinSmallGap" w:color="auto" w:sz="24" w:space="0"/>
+              <w:top w:val="thickThinSmallGap" w:sz="24" w:space="0" w:color="auto"/>
+              <w:bottom w:val="single" w:sz="6" w:space="0" w:color="auto"/>
+              <w:right w:val="thickThinSmallGap" w:sz="24" w:space="0" w:color="auto"/>
             </w:tcBorders>
-            <w:tcMar/>
           </w:tcPr>
           <w:p>
             <w:pPr>
@@ -472,11 +464,10 @@
           <w:tcPr>
             <w:tcW w:w="1705" w:type="pct"/>
             <w:tcBorders>
-              <w:top w:val="single" w:color="auto" w:sz="6" w:space="0"/>
-              <w:left w:val="thinThickSmallGap" w:color="auto" w:sz="24" w:space="0"/>
-              <w:bottom w:val="single" w:color="auto" w:sz="6" w:space="0"/>
+              <w:top w:val="single" w:sz="6" w:space="0" w:color="auto"/>
+              <w:left w:val="thinThickSmallGap" w:sz="24" w:space="0" w:color="auto"/>
+              <w:bottom w:val="single" w:sz="6" w:space="0" w:color="auto"/>
             </w:tcBorders>
-            <w:tcMar/>
           </w:tcPr>
           <w:p>
             <w:pPr>
@@ -495,10 +486,9 @@
           <w:tcPr>
             <w:tcW w:w="693" w:type="pct"/>
             <w:tcBorders>
-              <w:top w:val="single" w:color="auto" w:sz="6" w:space="0"/>
-              <w:bottom w:val="single" w:color="auto" w:sz="6" w:space="0"/>
+              <w:top w:val="single" w:sz="6" w:space="0" w:color="auto"/>
+              <w:bottom w:val="single" w:sz="6" w:space="0" w:color="auto"/>
             </w:tcBorders>
-            <w:tcMar/>
           </w:tcPr>
           <w:p>
             <w:pPr>
@@ -517,10 +507,9 @@
           <w:tcPr>
             <w:tcW w:w="2044" w:type="pct"/>
             <w:tcBorders>
-              <w:top w:val="single" w:color="auto" w:sz="6" w:space="0"/>
-              <w:bottom w:val="single" w:color="auto" w:sz="6" w:space="0"/>
+              <w:top w:val="single" w:sz="6" w:space="0" w:color="auto"/>
+              <w:bottom w:val="single" w:sz="6" w:space="0" w:color="auto"/>
             </w:tcBorders>
-            <w:tcMar/>
           </w:tcPr>
           <w:p>
             <w:pPr>
@@ -546,11 +535,10 @@
           <w:tcPr>
             <w:tcW w:w="559" w:type="pct"/>
             <w:tcBorders>
-              <w:top w:val="single" w:color="auto" w:sz="6" w:space="0"/>
-              <w:bottom w:val="single" w:color="auto" w:sz="6" w:space="0"/>
-              <w:right w:val="thickThinSmallGap" w:color="auto" w:sz="24" w:space="0"/>
+              <w:top w:val="single" w:sz="6" w:space="0" w:color="auto"/>
+              <w:bottom w:val="single" w:sz="6" w:space="0" w:color="auto"/>
+              <w:right w:val="thickThinSmallGap" w:sz="24" w:space="0" w:color="auto"/>
             </w:tcBorders>
-            <w:tcMar/>
           </w:tcPr>
           <w:p>
             <w:pPr>
@@ -571,12 +559,11 @@
           <w:tcPr>
             <w:tcW w:w="1705" w:type="pct"/>
             <w:tcBorders>
-              <w:top w:val="single" w:color="auto" w:sz="6" w:space="0"/>
-              <w:left w:val="thinThickSmallGap" w:color="auto" w:sz="24" w:space="0"/>
-              <w:bottom w:val="single" w:color="auto" w:sz="6" w:space="0"/>
-              <w:right w:val="single" w:color="auto" w:sz="6" w:space="0"/>
+              <w:top w:val="single" w:sz="6" w:space="0" w:color="auto"/>
+              <w:left w:val="thinThickSmallGap" w:sz="24" w:space="0" w:color="auto"/>
+              <w:bottom w:val="single" w:sz="6" w:space="0" w:color="auto"/>
+              <w:right w:val="single" w:sz="6" w:space="0" w:color="auto"/>
             </w:tcBorders>
-            <w:tcMar/>
           </w:tcPr>
           <w:p>
             <w:pPr>
@@ -595,12 +582,11 @@
           <w:tcPr>
             <w:tcW w:w="693" w:type="pct"/>
             <w:tcBorders>
-              <w:top w:val="single" w:color="auto" w:sz="6" w:space="0"/>
-              <w:left w:val="single" w:color="auto" w:sz="6" w:space="0"/>
-              <w:bottom w:val="single" w:color="auto" w:sz="6" w:space="0"/>
-              <w:right w:val="single" w:color="auto" w:sz="6" w:space="0"/>
+              <w:top w:val="single" w:sz="6" w:space="0" w:color="auto"/>
+              <w:left w:val="single" w:sz="6" w:space="0" w:color="auto"/>
+              <w:bottom w:val="single" w:sz="6" w:space="0" w:color="auto"/>
+              <w:right w:val="single" w:sz="6" w:space="0" w:color="auto"/>
             </w:tcBorders>
-            <w:tcMar/>
           </w:tcPr>
           <w:p>
             <w:pPr>
@@ -619,12 +605,11 @@
           <w:tcPr>
             <w:tcW w:w="2044" w:type="pct"/>
             <w:tcBorders>
-              <w:top w:val="single" w:color="auto" w:sz="6" w:space="0"/>
-              <w:left w:val="single" w:color="auto" w:sz="6" w:space="0"/>
-              <w:bottom w:val="single" w:color="auto" w:sz="6" w:space="0"/>
-              <w:right w:val="single" w:color="auto" w:sz="6" w:space="0"/>
+              <w:top w:val="single" w:sz="6" w:space="0" w:color="auto"/>
+              <w:left w:val="single" w:sz="6" w:space="0" w:color="auto"/>
+              <w:bottom w:val="single" w:sz="6" w:space="0" w:color="auto"/>
+              <w:right w:val="single" w:sz="6" w:space="0" w:color="auto"/>
             </w:tcBorders>
-            <w:tcMar/>
           </w:tcPr>
           <w:p>
             <w:pPr>
@@ -643,12 +628,11 @@
           <w:tcPr>
             <w:tcW w:w="559" w:type="pct"/>
             <w:tcBorders>
-              <w:top w:val="single" w:color="auto" w:sz="6" w:space="0"/>
-              <w:left w:val="single" w:color="auto" w:sz="6" w:space="0"/>
-              <w:bottom w:val="single" w:color="auto" w:sz="6" w:space="0"/>
-              <w:right w:val="thickThinSmallGap" w:color="auto" w:sz="24" w:space="0"/>
+              <w:top w:val="single" w:sz="6" w:space="0" w:color="auto"/>
+              <w:left w:val="single" w:sz="6" w:space="0" w:color="auto"/>
+              <w:bottom w:val="single" w:sz="6" w:space="0" w:color="auto"/>
+              <w:right w:val="thickThinSmallGap" w:sz="24" w:space="0" w:color="auto"/>
             </w:tcBorders>
-            <w:tcMar/>
           </w:tcPr>
           <w:p>
             <w:pPr>
@@ -669,12 +653,11 @@
           <w:tcPr>
             <w:tcW w:w="1705" w:type="pct"/>
             <w:tcBorders>
-              <w:top w:val="single" w:color="auto" w:sz="6" w:space="0"/>
-              <w:left w:val="thinThickSmallGap" w:color="auto" w:sz="24" w:space="0"/>
-              <w:bottom w:val="single" w:color="auto" w:sz="6" w:space="0"/>
-              <w:right w:val="single" w:color="auto" w:sz="6" w:space="0"/>
+              <w:top w:val="single" w:sz="6" w:space="0" w:color="auto"/>
+              <w:left w:val="thinThickSmallGap" w:sz="24" w:space="0" w:color="auto"/>
+              <w:bottom w:val="single" w:sz="6" w:space="0" w:color="auto"/>
+              <w:right w:val="single" w:sz="6" w:space="0" w:color="auto"/>
             </w:tcBorders>
-            <w:tcMar/>
           </w:tcPr>
           <w:p>
             <w:pPr>
@@ -693,12 +676,11 @@
           <w:tcPr>
             <w:tcW w:w="693" w:type="pct"/>
             <w:tcBorders>
-              <w:top w:val="single" w:color="auto" w:sz="6" w:space="0"/>
-              <w:left w:val="single" w:color="auto" w:sz="6" w:space="0"/>
-              <w:bottom w:val="single" w:color="auto" w:sz="6" w:space="0"/>
-              <w:right w:val="single" w:color="auto" w:sz="6" w:space="0"/>
+              <w:top w:val="single" w:sz="6" w:space="0" w:color="auto"/>
+              <w:left w:val="single" w:sz="6" w:space="0" w:color="auto"/>
+              <w:bottom w:val="single" w:sz="6" w:space="0" w:color="auto"/>
+              <w:right w:val="single" w:sz="6" w:space="0" w:color="auto"/>
             </w:tcBorders>
-            <w:tcMar/>
           </w:tcPr>
           <w:p>
             <w:pPr>
@@ -717,12 +699,11 @@
           <w:tcPr>
             <w:tcW w:w="2044" w:type="pct"/>
             <w:tcBorders>
-              <w:top w:val="single" w:color="auto" w:sz="6" w:space="0"/>
-              <w:left w:val="single" w:color="auto" w:sz="6" w:space="0"/>
-              <w:bottom w:val="single" w:color="auto" w:sz="6" w:space="0"/>
-              <w:right w:val="single" w:color="auto" w:sz="6" w:space="0"/>
+              <w:top w:val="single" w:sz="6" w:space="0" w:color="auto"/>
+              <w:left w:val="single" w:sz="6" w:space="0" w:color="auto"/>
+              <w:bottom w:val="single" w:sz="6" w:space="0" w:color="auto"/>
+              <w:right w:val="single" w:sz="6" w:space="0" w:color="auto"/>
             </w:tcBorders>
-            <w:tcMar/>
           </w:tcPr>
           <w:p>
             <w:pPr>
@@ -741,12 +722,11 @@
           <w:tcPr>
             <w:tcW w:w="559" w:type="pct"/>
             <w:tcBorders>
-              <w:top w:val="single" w:color="auto" w:sz="6" w:space="0"/>
-              <w:left w:val="single" w:color="auto" w:sz="6" w:space="0"/>
-              <w:bottom w:val="single" w:color="auto" w:sz="6" w:space="0"/>
-              <w:right w:val="thickThinSmallGap" w:color="auto" w:sz="24" w:space="0"/>
+              <w:top w:val="single" w:sz="6" w:space="0" w:color="auto"/>
+              <w:left w:val="single" w:sz="6" w:space="0" w:color="auto"/>
+              <w:bottom w:val="single" w:sz="6" w:space="0" w:color="auto"/>
+              <w:right w:val="thickThinSmallGap" w:sz="24" w:space="0" w:color="auto"/>
             </w:tcBorders>
-            <w:tcMar/>
           </w:tcPr>
           <w:p>
             <w:pPr>
@@ -767,12 +747,11 @@
           <w:tcPr>
             <w:tcW w:w="1705" w:type="pct"/>
             <w:tcBorders>
-              <w:top w:val="single" w:color="auto" w:sz="6" w:space="0"/>
-              <w:left w:val="thinThickSmallGap" w:color="auto" w:sz="24" w:space="0"/>
-              <w:bottom w:val="single" w:color="auto" w:sz="6" w:space="0"/>
-              <w:right w:val="single" w:color="auto" w:sz="6" w:space="0"/>
+              <w:top w:val="single" w:sz="6" w:space="0" w:color="auto"/>
+              <w:left w:val="thinThickSmallGap" w:sz="24" w:space="0" w:color="auto"/>
+              <w:bottom w:val="single" w:sz="6" w:space="0" w:color="auto"/>
+              <w:right w:val="single" w:sz="6" w:space="0" w:color="auto"/>
             </w:tcBorders>
-            <w:tcMar/>
           </w:tcPr>
           <w:p>
             <w:pPr>
@@ -788,12 +767,11 @@
           <w:tcPr>
             <w:tcW w:w="693" w:type="pct"/>
             <w:tcBorders>
-              <w:top w:val="single" w:color="auto" w:sz="6" w:space="0"/>
-              <w:left w:val="single" w:color="auto" w:sz="6" w:space="0"/>
-              <w:bottom w:val="single" w:color="auto" w:sz="6" w:space="0"/>
-              <w:right w:val="single" w:color="auto" w:sz="6" w:space="0"/>
+              <w:top w:val="single" w:sz="6" w:space="0" w:color="auto"/>
+              <w:left w:val="single" w:sz="6" w:space="0" w:color="auto"/>
+              <w:bottom w:val="single" w:sz="6" w:space="0" w:color="auto"/>
+              <w:right w:val="single" w:sz="6" w:space="0" w:color="auto"/>
             </w:tcBorders>
-            <w:tcMar/>
           </w:tcPr>
           <w:p>
             <w:pPr>
@@ -809,12 +787,11 @@
           <w:tcPr>
             <w:tcW w:w="2044" w:type="pct"/>
             <w:tcBorders>
-              <w:top w:val="single" w:color="auto" w:sz="6" w:space="0"/>
-              <w:left w:val="single" w:color="auto" w:sz="6" w:space="0"/>
-              <w:bottom w:val="single" w:color="auto" w:sz="6" w:space="0"/>
-              <w:right w:val="single" w:color="auto" w:sz="6" w:space="0"/>
+              <w:top w:val="single" w:sz="6" w:space="0" w:color="auto"/>
+              <w:left w:val="single" w:sz="6" w:space="0" w:color="auto"/>
+              <w:bottom w:val="single" w:sz="6" w:space="0" w:color="auto"/>
+              <w:right w:val="single" w:sz="6" w:space="0" w:color="auto"/>
             </w:tcBorders>
-            <w:tcMar/>
           </w:tcPr>
           <w:p>
             <w:pPr>
@@ -830,12 +807,11 @@
           <w:tcPr>
             <w:tcW w:w="559" w:type="pct"/>
             <w:tcBorders>
-              <w:top w:val="single" w:color="auto" w:sz="6" w:space="0"/>
-              <w:left w:val="single" w:color="auto" w:sz="6" w:space="0"/>
-              <w:bottom w:val="single" w:color="auto" w:sz="6" w:space="0"/>
-              <w:right w:val="thickThinSmallGap" w:color="auto" w:sz="24" w:space="0"/>
+              <w:top w:val="single" w:sz="6" w:space="0" w:color="auto"/>
+              <w:left w:val="single" w:sz="6" w:space="0" w:color="auto"/>
+              <w:bottom w:val="single" w:sz="6" w:space="0" w:color="auto"/>
+              <w:right w:val="thickThinSmallGap" w:sz="24" w:space="0" w:color="auto"/>
             </w:tcBorders>
-            <w:tcMar/>
           </w:tcPr>
           <w:p>
             <w:pPr>
@@ -853,12 +829,11 @@
           <w:tcPr>
             <w:tcW w:w="1705" w:type="pct"/>
             <w:tcBorders>
-              <w:top w:val="single" w:color="auto" w:sz="6" w:space="0"/>
-              <w:left w:val="thinThickSmallGap" w:color="auto" w:sz="24" w:space="0"/>
-              <w:bottom w:val="single" w:color="auto" w:sz="6" w:space="0"/>
-              <w:right w:val="single" w:color="auto" w:sz="6" w:space="0"/>
+              <w:top w:val="single" w:sz="6" w:space="0" w:color="auto"/>
+              <w:left w:val="thinThickSmallGap" w:sz="24" w:space="0" w:color="auto"/>
+              <w:bottom w:val="single" w:sz="6" w:space="0" w:color="auto"/>
+              <w:right w:val="single" w:sz="6" w:space="0" w:color="auto"/>
             </w:tcBorders>
-            <w:tcMar/>
           </w:tcPr>
           <w:p>
             <w:pPr>
@@ -874,12 +849,11 @@
           <w:tcPr>
             <w:tcW w:w="693" w:type="pct"/>
             <w:tcBorders>
-              <w:top w:val="single" w:color="auto" w:sz="6" w:space="0"/>
-              <w:left w:val="single" w:color="auto" w:sz="6" w:space="0"/>
-              <w:bottom w:val="single" w:color="auto" w:sz="6" w:space="0"/>
-              <w:right w:val="single" w:color="auto" w:sz="6" w:space="0"/>
+              <w:top w:val="single" w:sz="6" w:space="0" w:color="auto"/>
+              <w:left w:val="single" w:sz="6" w:space="0" w:color="auto"/>
+              <w:bottom w:val="single" w:sz="6" w:space="0" w:color="auto"/>
+              <w:right w:val="single" w:sz="6" w:space="0" w:color="auto"/>
             </w:tcBorders>
-            <w:tcMar/>
           </w:tcPr>
           <w:p>
             <w:pPr>
@@ -895,12 +869,11 @@
           <w:tcPr>
             <w:tcW w:w="2044" w:type="pct"/>
             <w:tcBorders>
-              <w:top w:val="single" w:color="auto" w:sz="6" w:space="0"/>
-              <w:left w:val="single" w:color="auto" w:sz="6" w:space="0"/>
-              <w:bottom w:val="single" w:color="auto" w:sz="6" w:space="0"/>
-              <w:right w:val="single" w:color="auto" w:sz="6" w:space="0"/>
+              <w:top w:val="single" w:sz="6" w:space="0" w:color="auto"/>
+              <w:left w:val="single" w:sz="6" w:space="0" w:color="auto"/>
+              <w:bottom w:val="single" w:sz="6" w:space="0" w:color="auto"/>
+              <w:right w:val="single" w:sz="6" w:space="0" w:color="auto"/>
             </w:tcBorders>
-            <w:tcMar/>
           </w:tcPr>
           <w:p>
             <w:pPr>
@@ -916,12 +889,11 @@
           <w:tcPr>
             <w:tcW w:w="559" w:type="pct"/>
             <w:tcBorders>
-              <w:top w:val="single" w:color="auto" w:sz="6" w:space="0"/>
-              <w:left w:val="single" w:color="auto" w:sz="6" w:space="0"/>
-              <w:bottom w:val="single" w:color="auto" w:sz="6" w:space="0"/>
-              <w:right w:val="thickThinSmallGap" w:color="auto" w:sz="24" w:space="0"/>
+              <w:top w:val="single" w:sz="6" w:space="0" w:color="auto"/>
+              <w:left w:val="single" w:sz="6" w:space="0" w:color="auto"/>
+              <w:bottom w:val="single" w:sz="6" w:space="0" w:color="auto"/>
+              <w:right w:val="thickThinSmallGap" w:sz="24" w:space="0" w:color="auto"/>
             </w:tcBorders>
-            <w:tcMar/>
           </w:tcPr>
           <w:p>
             <w:pPr>
@@ -939,12 +911,11 @@
           <w:tcPr>
             <w:tcW w:w="1705" w:type="pct"/>
             <w:tcBorders>
-              <w:top w:val="single" w:color="auto" w:sz="6" w:space="0"/>
-              <w:left w:val="thinThickSmallGap" w:color="auto" w:sz="24" w:space="0"/>
-              <w:bottom w:val="thickThinSmallGap" w:color="auto" w:sz="24" w:space="0"/>
-              <w:right w:val="single" w:color="auto" w:sz="6" w:space="0"/>
+              <w:top w:val="single" w:sz="6" w:space="0" w:color="auto"/>
+              <w:left w:val="thinThickSmallGap" w:sz="24" w:space="0" w:color="auto"/>
+              <w:bottom w:val="thickThinSmallGap" w:sz="24" w:space="0" w:color="auto"/>
+              <w:right w:val="single" w:sz="6" w:space="0" w:color="auto"/>
             </w:tcBorders>
-            <w:tcMar/>
           </w:tcPr>
           <w:p>
             <w:pPr>
@@ -960,12 +931,11 @@
           <w:tcPr>
             <w:tcW w:w="693" w:type="pct"/>
             <w:tcBorders>
-              <w:top w:val="single" w:color="auto" w:sz="6" w:space="0"/>
-              <w:left w:val="single" w:color="auto" w:sz="6" w:space="0"/>
-              <w:bottom w:val="thickThinSmallGap" w:color="auto" w:sz="24" w:space="0"/>
-              <w:right w:val="single" w:color="auto" w:sz="6" w:space="0"/>
+              <w:top w:val="single" w:sz="6" w:space="0" w:color="auto"/>
+              <w:left w:val="single" w:sz="6" w:space="0" w:color="auto"/>
+              <w:bottom w:val="thickThinSmallGap" w:sz="24" w:space="0" w:color="auto"/>
+              <w:right w:val="single" w:sz="6" w:space="0" w:color="auto"/>
             </w:tcBorders>
-            <w:tcMar/>
           </w:tcPr>
           <w:p>
             <w:pPr>
@@ -981,12 +951,11 @@
           <w:tcPr>
             <w:tcW w:w="2044" w:type="pct"/>
             <w:tcBorders>
-              <w:top w:val="single" w:color="auto" w:sz="6" w:space="0"/>
-              <w:left w:val="single" w:color="auto" w:sz="6" w:space="0"/>
-              <w:bottom w:val="thickThinSmallGap" w:color="auto" w:sz="24" w:space="0"/>
-              <w:right w:val="single" w:color="auto" w:sz="6" w:space="0"/>
+              <w:top w:val="single" w:sz="6" w:space="0" w:color="auto"/>
+              <w:left w:val="single" w:sz="6" w:space="0" w:color="auto"/>
+              <w:bottom w:val="thickThinSmallGap" w:sz="24" w:space="0" w:color="auto"/>
+              <w:right w:val="single" w:sz="6" w:space="0" w:color="auto"/>
             </w:tcBorders>
-            <w:tcMar/>
           </w:tcPr>
           <w:p>
             <w:pPr>
@@ -1002,12 +971,11 @@
           <w:tcPr>
             <w:tcW w:w="559" w:type="pct"/>
             <w:tcBorders>
-              <w:top w:val="single" w:color="auto" w:sz="6" w:space="0"/>
-              <w:left w:val="single" w:color="auto" w:sz="6" w:space="0"/>
-              <w:bottom w:val="thickThinSmallGap" w:color="auto" w:sz="24" w:space="0"/>
-              <w:right w:val="thickThinSmallGap" w:color="auto" w:sz="24" w:space="0"/>
+              <w:top w:val="single" w:sz="6" w:space="0" w:color="auto"/>
+              <w:left w:val="single" w:sz="6" w:space="0" w:color="auto"/>
+              <w:bottom w:val="thickThinSmallGap" w:sz="24" w:space="0" w:color="auto"/>
+              <w:right w:val="thickThinSmallGap" w:sz="24" w:space="0" w:color="auto"/>
             </w:tcBorders>
-            <w:tcMar/>
           </w:tcPr>
           <w:p>
             <w:pPr>
@@ -1025,11 +993,10 @@
       <w:pPr>
         <w:pStyle w:val="NormalWeb"/>
         <w:spacing w:line="360" w:lineRule="auto"/>
-        <w:ind/>
         <w:jc w:val="center"/>
         <w:rPr>
-          <w:b w:val="1"/>
-          <w:bCs w:val="1"/>
+          <w:b/>
+          <w:bCs/>
           <w:noProof/>
           <w:sz w:val="28"/>
           <w:szCs w:val="28"/>
@@ -1042,7 +1009,7 @@
         <w:pStyle w:val="NormalWeb"/>
         <w:numPr>
           <w:ilvl w:val="0"/>
-          <w:numId w:val="1"/>
+          <w:numId w:val="3"/>
         </w:numPr>
         <w:spacing w:line="360" w:lineRule="auto"/>
         <w:ind w:right="300"/>
@@ -1073,7 +1040,7 @@
         <w:pStyle w:val="NormalWeb"/>
         <w:numPr>
           <w:ilvl w:val="1"/>
-          <w:numId w:val="1"/>
+          <w:numId w:val="3"/>
         </w:numPr>
         <w:spacing w:line="360" w:lineRule="auto"/>
         <w:ind w:right="300"/>
@@ -1101,7 +1068,7 @@
     <w:p>
       <w:pPr>
         <w:pStyle w:val="NormalWeb"/>
-        <w:spacing w:before="0" w:beforeAutospacing="off" w:after="120" w:afterAutospacing="off" w:line="360" w:lineRule="auto"/>
+        <w:spacing w:before="0" w:beforeAutospacing="0" w:after="120" w:afterAutospacing="0" w:line="360" w:lineRule="auto"/>
         <w:ind w:left="357" w:right="301"/>
         <w:rPr>
           <w:rFonts w:ascii="Arial" w:hAnsi="Arial" w:cs="Arial"/>
@@ -1119,7 +1086,47 @@
           <w:szCs w:val="20"/>
           <w:lang w:val="es-GT"/>
         </w:rPr>
-        <w:t>Permitir que cualquier ciudadano acceda al portal web de la Municipalidad de Granados B.V para conocer la información institucional, donde el ciudadano podrá iniciar el registro de una queja, sugerencia o denuncia, permitiendo así mismo a personal municipal acceder al sistema mediante autenticación.</w:t>
+        <w:t xml:space="preserve">Permitir que cualquier ciudadano acceda al portal web de la Municipalidad de Granados B.V para conocer la información institucional, donde el ciudadano podrá </w:t>
+      </w:r>
+      <w:r>
+        <w:rPr>
+          <w:rFonts w:ascii="Arial" w:hAnsi="Arial" w:cs="Arial"/>
+          <w:noProof/>
+          <w:sz w:val="20"/>
+          <w:szCs w:val="20"/>
+          <w:lang w:val="es-GT"/>
+        </w:rPr>
+        <w:t>realizar el</w:t>
+      </w:r>
+      <w:r>
+        <w:rPr>
+          <w:rFonts w:ascii="Arial" w:hAnsi="Arial" w:cs="Arial"/>
+          <w:noProof/>
+          <w:sz w:val="20"/>
+          <w:szCs w:val="20"/>
+          <w:lang w:val="es-GT"/>
+        </w:rPr>
+        <w:t xml:space="preserve"> registro de una queja, sugerencia o denuncia, permitiendo así mismo a</w:t>
+      </w:r>
+      <w:r>
+        <w:rPr>
+          <w:rFonts w:ascii="Arial" w:hAnsi="Arial" w:cs="Arial"/>
+          <w:noProof/>
+          <w:sz w:val="20"/>
+          <w:szCs w:val="20"/>
+          <w:lang w:val="es-GT"/>
+        </w:rPr>
+        <w:t>l</w:t>
+      </w:r>
+      <w:r>
+        <w:rPr>
+          <w:rFonts w:ascii="Arial" w:hAnsi="Arial" w:cs="Arial"/>
+          <w:noProof/>
+          <w:sz w:val="20"/>
+          <w:szCs w:val="20"/>
+          <w:lang w:val="es-GT"/>
+        </w:rPr>
+        <w:t xml:space="preserve"> personal municipal acceder al sistema mediante autenticación.</w:t>
       </w:r>
     </w:p>
     <w:p>
@@ -1127,7 +1134,7 @@
         <w:pStyle w:val="NormalWeb"/>
         <w:numPr>
           <w:ilvl w:val="0"/>
-          <w:numId w:val="1"/>
+          <w:numId w:val="3"/>
         </w:numPr>
         <w:spacing w:line="360" w:lineRule="auto"/>
         <w:ind w:right="300"/>
@@ -1140,7 +1147,7 @@
           <w:lang w:val="es-ES_tradnl"/>
         </w:rPr>
       </w:pPr>
-      <w:bookmarkStart w:name="1" w:id="0"/>
+      <w:bookmarkStart w:id="0" w:name="1"/>
       <w:r>
         <w:rPr>
           <w:rFonts w:ascii="Arial" w:hAnsi="Arial" w:cs="Arial"/>
@@ -1158,7 +1165,7 @@
         <w:pStyle w:val="NormalWeb"/>
         <w:numPr>
           <w:ilvl w:val="1"/>
-          <w:numId w:val="1"/>
+          <w:numId w:val="3"/>
         </w:numPr>
         <w:spacing w:line="360" w:lineRule="auto"/>
         <w:ind w:right="300"/>
@@ -1185,10 +1192,10 @@
     </w:p>
     <w:p>
       <w:pPr>
-        <w:pStyle w:val="Textoindependiente"/>
+        <w:pStyle w:val="BodyText"/>
         <w:numPr>
           <w:ilvl w:val="2"/>
-          <w:numId w:val="1"/>
+          <w:numId w:val="3"/>
         </w:numPr>
         <w:spacing w:line="360" w:lineRule="auto"/>
         <w:jc w:val="both"/>
@@ -1215,10 +1222,10 @@
     </w:p>
     <w:p>
       <w:pPr>
-        <w:pStyle w:val="Textoindependiente"/>
+        <w:pStyle w:val="BodyText"/>
         <w:numPr>
           <w:ilvl w:val="2"/>
-          <w:numId w:val="1"/>
+          <w:numId w:val="3"/>
         </w:numPr>
         <w:spacing w:line="360" w:lineRule="auto"/>
         <w:jc w:val="both"/>
@@ -1245,10 +1252,10 @@
     </w:p>
     <w:p>
       <w:pPr>
-        <w:pStyle w:val="Textoindependiente"/>
+        <w:pStyle w:val="BodyText"/>
         <w:numPr>
           <w:ilvl w:val="2"/>
-          <w:numId w:val="1"/>
+          <w:numId w:val="3"/>
         </w:numPr>
         <w:spacing w:line="360" w:lineRule="auto"/>
         <w:jc w:val="both"/>
@@ -1278,7 +1285,7 @@
         <w:pStyle w:val="NormalWeb"/>
         <w:numPr>
           <w:ilvl w:val="1"/>
-          <w:numId w:val="1"/>
+          <w:numId w:val="3"/>
         </w:numPr>
         <w:spacing w:line="360" w:lineRule="auto"/>
         <w:ind w:right="300"/>
@@ -1305,10 +1312,10 @@
     </w:p>
     <w:p>
       <w:pPr>
-        <w:pStyle w:val="Textoindependiente"/>
+        <w:pStyle w:val="BodyText"/>
         <w:numPr>
           <w:ilvl w:val="2"/>
-          <w:numId w:val="1"/>
+          <w:numId w:val="3"/>
         </w:numPr>
         <w:spacing w:line="360" w:lineRule="auto"/>
         <w:ind w:left="1225" w:hanging="505"/>
@@ -1363,10 +1370,10 @@
     </w:p>
     <w:p>
       <w:pPr>
-        <w:pStyle w:val="Textoindependiente"/>
+        <w:pStyle w:val="BodyText"/>
         <w:numPr>
           <w:ilvl w:val="2"/>
-          <w:numId w:val="1"/>
+          <w:numId w:val="3"/>
         </w:numPr>
         <w:spacing w:line="360" w:lineRule="auto"/>
         <w:ind w:left="1225" w:hanging="505"/>
@@ -1384,88 +1391,7 @@
           <w:sz w:val="20"/>
           <w:szCs w:val="20"/>
         </w:rPr>
-        <w:t>Que e</w:t>
-      </w:r>
-      <w:r>
-        <w:rPr>
-          <w:rFonts w:ascii="Arial" w:hAnsi="Arial" w:cs="Arial"/>
-          <w:noProof/>
-          <w:sz w:val="20"/>
-          <w:szCs w:val="20"/>
-        </w:rPr>
-        <w:t>l usuario</w:t>
-      </w:r>
-      <w:r>
-        <w:rPr>
-          <w:rFonts w:ascii="Arial" w:hAnsi="Arial" w:cs="Arial"/>
-          <w:noProof/>
-          <w:sz w:val="20"/>
-          <w:szCs w:val="20"/>
-        </w:rPr>
-        <w:t xml:space="preserve"> y empleado municipal</w:t>
-      </w:r>
-      <w:r>
-        <w:rPr>
-          <w:rFonts w:ascii="Arial" w:hAnsi="Arial" w:cs="Arial"/>
-          <w:noProof/>
-          <w:sz w:val="20"/>
-          <w:szCs w:val="20"/>
-        </w:rPr>
-        <w:t xml:space="preserve"> </w:t>
-      </w:r>
-      <w:r>
-        <w:rPr>
-          <w:rFonts w:ascii="Arial" w:hAnsi="Arial" w:cs="Arial"/>
-          <w:noProof/>
-          <w:sz w:val="20"/>
-          <w:szCs w:val="20"/>
-        </w:rPr>
-        <w:t>disponga</w:t>
-      </w:r>
-      <w:r>
-        <w:rPr>
-          <w:rFonts w:ascii="Arial" w:hAnsi="Arial" w:cs="Arial"/>
-          <w:noProof/>
-          <w:sz w:val="20"/>
-          <w:szCs w:val="20"/>
-        </w:rPr>
-        <w:t>n</w:t>
-      </w:r>
-      <w:r>
-        <w:rPr>
-          <w:rFonts w:ascii="Arial" w:hAnsi="Arial" w:cs="Arial"/>
-          <w:noProof/>
-          <w:sz w:val="20"/>
-          <w:szCs w:val="20"/>
-        </w:rPr>
-        <w:t xml:space="preserve"> </w:t>
-      </w:r>
-      <w:r>
-        <w:rPr>
-          <w:rFonts w:ascii="Arial" w:hAnsi="Arial" w:cs="Arial"/>
-          <w:noProof/>
-          <w:sz w:val="20"/>
-          <w:szCs w:val="20"/>
-        </w:rPr>
-        <w:t xml:space="preserve">de acceso a </w:t>
-      </w:r>
-      <w:r>
-        <w:rPr>
-          <w:rFonts w:ascii="Arial" w:hAnsi="Arial" w:cs="Arial"/>
-          <w:noProof/>
-          <w:sz w:val="20"/>
-          <w:szCs w:val="20"/>
-        </w:rPr>
-        <w:t>i</w:t>
-      </w:r>
-      <w:r>
-        <w:rPr>
-          <w:rFonts w:ascii="Arial" w:hAnsi="Arial" w:cs="Arial"/>
-          <w:noProof/>
-          <w:sz w:val="20"/>
-          <w:szCs w:val="20"/>
-        </w:rPr>
-        <w:t>nternet y cuenten con credenciales para acceder.</w:t>
+        <w:t>Que el usuario y empleado municipal dispongan de acceso a internet y cuenten con credenciales para acceder.</w:t>
       </w:r>
     </w:p>
     <w:p>
@@ -1473,7 +1399,7 @@
         <w:pStyle w:val="NormalWeb"/>
         <w:numPr>
           <w:ilvl w:val="1"/>
-          <w:numId w:val="1"/>
+          <w:numId w:val="3"/>
         </w:numPr>
         <w:spacing w:line="360" w:lineRule="auto"/>
         <w:ind w:right="300"/>
@@ -1489,21 +1415,20 @@
       <w:r>
         <w:rPr>
           <w:rFonts w:ascii="Arial" w:hAnsi="Arial" w:cs="Arial"/>
-          <w:b w:val="1"/>
-          <w:bCs w:val="1"/>
+          <w:b/>
+          <w:bCs/>
           <w:sz w:val="27"/>
           <w:szCs w:val="27"/>
-          <w:lang w:val="es-ES"/>
         </w:rPr>
         <w:t xml:space="preserve">Flujo Normal Básico </w:t>
       </w:r>
     </w:p>
     <w:p>
       <w:pPr>
-        <w:pStyle w:val="Textoindependiente"/>
+        <w:pStyle w:val="BodyText"/>
         <w:numPr>
           <w:ilvl w:val="0"/>
-          <w:numId w:val="2"/>
+          <w:numId w:val="4"/>
         </w:numPr>
         <w:spacing w:line="360" w:lineRule="auto"/>
         <w:jc w:val="both"/>
@@ -1541,10 +1466,10 @@
     </w:p>
     <w:p>
       <w:pPr>
-        <w:pStyle w:val="Textoindependiente"/>
+        <w:pStyle w:val="BodyText"/>
         <w:numPr>
           <w:ilvl w:val="0"/>
-          <w:numId w:val="2"/>
+          <w:numId w:val="4"/>
         </w:numPr>
         <w:spacing w:line="360" w:lineRule="auto"/>
         <w:jc w:val="both"/>
@@ -1562,17 +1487,16 @@
           <w:noProof/>
           <w:sz w:val="20"/>
           <w:szCs w:val="20"/>
-          <w:lang w:val="es-ES"/>
         </w:rPr>
         <w:t>El ciudadano seleciona el botón “Ingresa tu queja”. CU-02, FA03, FA04</w:t>
       </w:r>
     </w:p>
     <w:p>
       <w:pPr>
-        <w:pStyle w:val="Textoindependiente"/>
+        <w:pStyle w:val="BodyText"/>
         <w:numPr>
           <w:ilvl w:val="0"/>
-          <w:numId w:val="2"/>
+          <w:numId w:val="4"/>
         </w:numPr>
         <w:spacing w:line="360" w:lineRule="auto"/>
         <w:jc w:val="both"/>
@@ -1590,7 +1514,6 @@
           <w:noProof/>
           <w:sz w:val="20"/>
           <w:szCs w:val="20"/>
-          <w:lang w:val="es-ES"/>
         </w:rPr>
         <w:t>Fin del caso de uso</w:t>
       </w:r>
@@ -1600,7 +1523,7 @@
         <w:pStyle w:val="NormalWeb"/>
         <w:numPr>
           <w:ilvl w:val="1"/>
-          <w:numId w:val="1"/>
+          <w:numId w:val="3"/>
         </w:numPr>
         <w:spacing w:line="360" w:lineRule="auto"/>
         <w:ind w:right="300"/>
@@ -1627,7 +1550,7 @@
     </w:p>
     <w:p>
       <w:pPr>
-        <w:pStyle w:val="Textoindependiente"/>
+        <w:pStyle w:val="BodyText"/>
         <w:ind w:left="360"/>
         <w:jc w:val="both"/>
         <w:rPr>
@@ -1642,268 +1565,19 @@
       <w:r>
         <w:rPr>
           <w:rFonts w:ascii="Arial" w:hAnsi="Arial" w:cs="Arial"/>
-          <w:b w:val="1"/>
-          <w:bCs w:val="1"/>
-          <w:noProof/>
-          <w:sz w:val="20"/>
-          <w:szCs w:val="20"/>
-          <w:lang w:val="es-GT"/>
-        </w:rPr>
-        <w:t>FA01: Portal de inicio</w:t>
-      </w:r>
-    </w:p>
-    <w:p>
-      <w:pPr>
-        <w:pStyle w:val="Textoindependiente"/>
-        <w:numPr>
-          <w:ilvl w:val="0"/>
-          <w:numId w:val="3"/>
-        </w:numPr>
-        <w:jc w:val="both"/>
-        <w:rPr>
-          <w:rFonts w:ascii="Arial" w:hAnsi="Arial" w:cs="Arial"/>
-          <w:noProof/>
-          <w:sz w:val="20"/>
-          <w:szCs w:val="20"/>
-          <w:lang w:val="es-GT"/>
-        </w:rPr>
-      </w:pPr>
-      <w:r>
-        <w:rPr>
-          <w:rFonts w:ascii="Arial" w:hAnsi="Arial" w:cs="Arial"/>
-          <w:noProof/>
-          <w:sz w:val="20"/>
-          <w:szCs w:val="20"/>
-          <w:lang w:val="es-GT"/>
-        </w:rPr>
-        <w:t xml:space="preserve">El sistema muestra la visión de la municipalidad. </w:t>
-      </w:r>
-    </w:p>
-    <w:p>
-      <w:pPr>
-        <w:pStyle w:val="Textoindependiente"/>
-        <w:numPr>
-          <w:ilvl w:val="0"/>
-          <w:numId w:val="3"/>
-        </w:numPr>
-        <w:ind/>
-        <w:jc w:val="both"/>
-        <w:rPr>
-          <w:rFonts w:ascii="Arial" w:hAnsi="Arial" w:cs="Arial"/>
-          <w:noProof/>
-          <w:sz w:val="20"/>
-          <w:szCs w:val="20"/>
-          <w:lang w:val="es-GT"/>
-        </w:rPr>
-      </w:pPr>
-      <w:r>
-        <w:rPr>
-          <w:rFonts w:ascii="Arial" w:hAnsi="Arial" w:cs="Arial"/>
-          <w:noProof/>
-          <w:sz w:val="20"/>
-          <w:szCs w:val="20"/>
-          <w:lang w:val="es-GT"/>
-        </w:rPr>
-        <w:t xml:space="preserve">El sistema muestra la misión de la municipalidad. </w:t>
-      </w:r>
-    </w:p>
-    <w:p>
-      <w:pPr>
-        <w:pStyle w:val="Textoindependiente"/>
-        <w:numPr>
-          <w:ilvl w:val="0"/>
-          <w:numId w:val="3"/>
-        </w:numPr>
-        <w:jc w:val="both"/>
-        <w:rPr>
-          <w:rFonts w:ascii="Arial" w:hAnsi="Arial" w:cs="Arial"/>
-          <w:noProof/>
-          <w:sz w:val="20"/>
-          <w:szCs w:val="20"/>
-          <w:lang w:val="es-GT"/>
-        </w:rPr>
-      </w:pPr>
-      <w:r>
-        <w:rPr>
-          <w:rFonts w:ascii="Arial" w:hAnsi="Arial" w:cs="Arial"/>
-          <w:noProof/>
-          <w:sz w:val="20"/>
-          <w:szCs w:val="20"/>
-          <w:lang w:val="es-GT"/>
-        </w:rPr>
-        <w:t>Fin del caso de uso</w:t>
-      </w:r>
-    </w:p>
-    <w:p>
-      <w:pPr>
-        <w:pStyle w:val="Textoindependiente"/>
-        <w:ind w:left="1080"/>
-        <w:jc w:val="both"/>
-        <w:rPr>
-          <w:rFonts w:ascii="Arial" w:hAnsi="Arial" w:cs="Arial"/>
-          <w:noProof/>
-          <w:sz w:val="20"/>
-          <w:szCs w:val="20"/>
-          <w:lang w:val="es-GT"/>
-        </w:rPr>
-      </w:pPr>
-    </w:p>
-    <w:p>
-      <w:pPr>
-        <w:pStyle w:val="Textoindependiente"/>
-        <w:ind w:left="360"/>
-        <w:jc w:val="both"/>
-        <w:rPr>
-          <w:rFonts w:ascii="Arial" w:hAnsi="Arial" w:cs="Arial"/>
           <w:b/>
           <w:bCs/>
-          <w:iCs/>
-          <w:noProof/>
-          <w:sz w:val="20"/>
-          <w:szCs w:val="20"/>
-          <w:lang w:val="es-GT"/>
-        </w:rPr>
-      </w:pPr>
-      <w:r>
-        <w:rPr>
-          <w:rFonts w:ascii="Arial" w:hAnsi="Arial" w:cs="Arial"/>
-          <w:b/>
-          <w:bCs/>
-          <w:iCs/>
-          <w:noProof/>
-          <w:sz w:val="20"/>
-          <w:szCs w:val="20"/>
-          <w:lang w:val="es-GT"/>
-        </w:rPr>
-        <w:t>FA02: Portal</w:t>
-      </w:r>
-      <w:r>
-        <w:rPr>
-          <w:rFonts w:ascii="Arial" w:hAnsi="Arial" w:cs="Arial"/>
-          <w:b/>
-          <w:bCs/>
-          <w:iCs/>
-          <w:noProof/>
-          <w:sz w:val="20"/>
-          <w:szCs w:val="20"/>
-          <w:lang w:val="es-GT"/>
-        </w:rPr>
-        <w:t xml:space="preserve"> de inicio</w:t>
-      </w:r>
-      <w:r>
-        <w:rPr>
-          <w:rFonts w:ascii="Arial" w:hAnsi="Arial" w:cs="Arial"/>
-          <w:b/>
-          <w:bCs/>
-          <w:iCs/>
-          <w:noProof/>
-          <w:sz w:val="20"/>
-          <w:szCs w:val="20"/>
-          <w:lang w:val="es-GT"/>
-        </w:rPr>
-        <w:t xml:space="preserve"> no disponible</w:t>
-      </w:r>
-    </w:p>
-    <w:p>
-      <w:pPr>
-        <w:pStyle w:val="Textoindependiente"/>
-        <w:numPr>
-          <w:ilvl w:val="0"/>
-          <w:numId w:val="4"/>
-        </w:numPr>
-        <w:jc w:val="both"/>
-        <w:rPr>
-          <w:rFonts w:ascii="Arial" w:hAnsi="Arial" w:cs="Arial"/>
-          <w:iCs/>
-          <w:noProof/>
-          <w:sz w:val="20"/>
-          <w:szCs w:val="20"/>
-          <w:lang w:val="es-GT"/>
-        </w:rPr>
-      </w:pPr>
-      <w:r>
-        <w:rPr>
-          <w:rFonts w:ascii="Arial" w:hAnsi="Arial" w:cs="Arial"/>
-          <w:noProof/>
-          <w:sz w:val="20"/>
-          <w:szCs w:val="20"/>
-          <w:lang w:val="es-GT"/>
-        </w:rPr>
-        <w:t>El sistema muestra un mensaje indicando que el servicio no está disponible. AN02 No. 5</w:t>
-      </w:r>
-    </w:p>
-    <w:p>
-      <w:pPr>
-        <w:pStyle w:val="Textoindependiente"/>
-        <w:numPr>
-          <w:ilvl w:val="0"/>
-          <w:numId w:val="4"/>
-        </w:numPr>
-        <w:jc w:val="both"/>
-        <w:rPr>
-          <w:rFonts w:ascii="Arial" w:hAnsi="Arial" w:cs="Arial"/>
-          <w:noProof/>
-          <w:sz w:val="20"/>
-          <w:szCs w:val="20"/>
-          <w:lang w:val="es-GT"/>
-        </w:rPr>
-      </w:pPr>
-      <w:r>
-        <w:rPr>
-          <w:rFonts w:ascii="Arial" w:hAnsi="Arial" w:cs="Arial"/>
-          <w:noProof/>
-          <w:sz w:val="20"/>
-          <w:szCs w:val="20"/>
-          <w:lang w:val="es-GT"/>
-        </w:rPr>
-        <w:t>Fin del caso de uso</w:t>
-      </w:r>
-    </w:p>
-    <w:p>
-      <w:pPr>
-        <w:pStyle w:val="Textoindependiente"/>
-        <w:ind w:left="1080"/>
-        <w:jc w:val="both"/>
-        <w:rPr>
-          <w:rFonts w:ascii="Arial" w:hAnsi="Arial" w:cs="Arial"/>
-          <w:noProof/>
-          <w:sz w:val="20"/>
-          <w:szCs w:val="20"/>
-          <w:lang w:val="es-GT"/>
-        </w:rPr>
-      </w:pPr>
-    </w:p>
-    <w:p>
-      <w:pPr>
-        <w:pStyle w:val="Textoindependiente"/>
-        <w:ind w:left="360"/>
-        <w:jc w:val="both"/>
-        <w:rPr>
-          <w:rFonts w:ascii="Arial" w:hAnsi="Arial" w:cs="Arial"/>
-          <w:b w:val="1"/>
-          <w:bCs w:val="1"/>
-          <w:noProof/>
-          <w:sz w:val="20"/>
-          <w:szCs w:val="20"/>
-          <w:lang w:val="es-GT"/>
-        </w:rPr>
-      </w:pPr>
-      <w:r>
-        <w:rPr>
-          <w:rFonts w:ascii="Arial" w:hAnsi="Arial" w:cs="Arial"/>
-          <w:b w:val="1"/>
-          <w:bCs w:val="1"/>
-          <w:noProof/>
-          <w:sz w:val="20"/>
-          <w:szCs w:val="20"/>
-          <w:lang w:val="es-GT"/>
-        </w:rPr>
-        <w:t>FA03: El ciudadano Consulta el Estado del caso</w:t>
-      </w:r>
-    </w:p>
-    <w:p>
-      <w:pPr>
-        <w:pStyle w:val="Textoindependiente"/>
+          <w:noProof/>
+          <w:sz w:val="20"/>
+          <w:szCs w:val="20"/>
+          <w:lang w:val="es-GT"/>
+        </w:rPr>
+        <w:t>FA01: Portal de inicio</w:t>
+      </w:r>
+    </w:p>
+    <w:p>
+      <w:pPr>
+        <w:pStyle w:val="BodyText"/>
         <w:numPr>
           <w:ilvl w:val="0"/>
           <w:numId w:val="5"/>
@@ -1925,12 +1599,12 @@
           <w:szCs w:val="20"/>
           <w:lang w:val="es-GT"/>
         </w:rPr>
-        <w:t xml:space="preserve">El sistema muestra el botón “consultar estado del caso”  </w:t>
-      </w:r>
-    </w:p>
-    <w:p>
-      <w:pPr>
-        <w:pStyle w:val="Textoindependiente"/>
+        <w:t xml:space="preserve">El sistema muestra la visión de la municipalidad. </w:t>
+      </w:r>
+    </w:p>
+    <w:p>
+      <w:pPr>
+        <w:pStyle w:val="BodyText"/>
         <w:numPr>
           <w:ilvl w:val="0"/>
           <w:numId w:val="5"/>
@@ -1952,12 +1626,12 @@
           <w:szCs w:val="20"/>
           <w:lang w:val="es-GT"/>
         </w:rPr>
-        <w:t>El ciudadano selecciona el botón “consultar estado del caso” CU-02</w:t>
-      </w:r>
-    </w:p>
-    <w:p>
-      <w:pPr>
-        <w:pStyle w:val="Textoindependiente"/>
+        <w:t xml:space="preserve">El sistema muestra la misión de la municipalidad. </w:t>
+      </w:r>
+    </w:p>
+    <w:p>
+      <w:pPr>
+        <w:pStyle w:val="BodyText"/>
         <w:numPr>
           <w:ilvl w:val="0"/>
           <w:numId w:val="5"/>
@@ -1984,8 +1658,8 @@
     </w:p>
     <w:p>
       <w:pPr>
-        <w:pStyle w:val="Textoindependiente"/>
-        <w:ind w:left="1440"/>
+        <w:pStyle w:val="BodyText"/>
+        <w:ind w:left="1080"/>
         <w:jc w:val="both"/>
         <w:rPr>
           <w:rFonts w:ascii="Arial" w:hAnsi="Arial" w:cs="Arial"/>
@@ -1998,45 +1672,63 @@
     </w:p>
     <w:p>
       <w:pPr>
-        <w:pStyle w:val="Textoindependiente"/>
-        <w:ind w:left="0"/>
+        <w:pStyle w:val="BodyText"/>
+        <w:ind w:left="360"/>
         <w:jc w:val="both"/>
         <w:rPr>
           <w:rFonts w:ascii="Arial" w:hAnsi="Arial" w:cs="Arial"/>
-          <w:b w:val="1"/>
-          <w:bCs w:val="1"/>
-          <w:noProof/>
-          <w:sz w:val="20"/>
-          <w:szCs w:val="20"/>
-          <w:lang w:val="es-GT"/>
-        </w:rPr>
-      </w:pPr>
-      <w:r>
-        <w:rPr>
-          <w:rFonts w:ascii="Arial" w:hAnsi="Arial" w:cs="Arial"/>
-          <w:noProof/>
-          <w:sz w:val="20"/>
-          <w:szCs w:val="20"/>
-          <w:lang w:val="es-GT"/>
-        </w:rPr>
-        <w:t xml:space="preserve">       </w:t>
-      </w:r>
-      <w:r>
-        <w:rPr>
-          <w:rFonts w:ascii="Arial" w:hAnsi="Arial" w:cs="Arial"/>
-          <w:b w:val="1"/>
-          <w:bCs w:val="1"/>
-          <w:noProof/>
-          <w:sz w:val="20"/>
-          <w:szCs w:val="20"/>
-          <w:lang w:val="es-GT"/>
-        </w:rPr>
-        <w:t>FA04: Inicio de sesión</w:t>
-      </w:r>
-    </w:p>
-    <w:p>
-      <w:pPr>
-        <w:pStyle w:val="Textoindependiente"/>
+          <w:b/>
+          <w:bCs/>
+          <w:iCs/>
+          <w:noProof/>
+          <w:sz w:val="20"/>
+          <w:szCs w:val="20"/>
+          <w:lang w:val="es-GT"/>
+        </w:rPr>
+      </w:pPr>
+      <w:r>
+        <w:rPr>
+          <w:rFonts w:ascii="Arial" w:hAnsi="Arial" w:cs="Arial"/>
+          <w:b/>
+          <w:bCs/>
+          <w:iCs/>
+          <w:noProof/>
+          <w:sz w:val="20"/>
+          <w:szCs w:val="20"/>
+          <w:lang w:val="es-GT"/>
+        </w:rPr>
+        <w:t>FA02: Portal</w:t>
+      </w:r>
+      <w:r>
+        <w:rPr>
+          <w:rFonts w:ascii="Arial" w:hAnsi="Arial" w:cs="Arial"/>
+          <w:b/>
+          <w:bCs/>
+          <w:iCs/>
+          <w:noProof/>
+          <w:sz w:val="20"/>
+          <w:szCs w:val="20"/>
+          <w:lang w:val="es-GT"/>
+        </w:rPr>
+        <w:t xml:space="preserve"> de inicio</w:t>
+      </w:r>
+      <w:r>
+        <w:rPr>
+          <w:rFonts w:ascii="Arial" w:hAnsi="Arial" w:cs="Arial"/>
+          <w:b/>
+          <w:bCs/>
+          <w:iCs/>
+          <w:noProof/>
+          <w:sz w:val="20"/>
+          <w:szCs w:val="20"/>
+          <w:lang w:val="es-GT"/>
+        </w:rPr>
+        <w:t xml:space="preserve"> no disponible</w:t>
+      </w:r>
+    </w:p>
+    <w:p>
+      <w:pPr>
+        <w:pStyle w:val="BodyText"/>
         <w:numPr>
           <w:ilvl w:val="0"/>
           <w:numId w:val="6"/>
@@ -2044,26 +1736,27 @@
         <w:jc w:val="both"/>
         <w:rPr>
           <w:rFonts w:ascii="Arial" w:hAnsi="Arial" w:cs="Arial"/>
-          <w:noProof/>
-          <w:sz w:val="20"/>
-          <w:szCs w:val="20"/>
-          <w:lang w:val="es-GT"/>
-        </w:rPr>
-      </w:pPr>
-      <w:r>
-        <w:rPr>
-          <w:rFonts w:ascii="Arial" w:hAnsi="Arial" w:cs="Arial"/>
-          <w:noProof/>
-          <w:sz w:val="20"/>
-          <w:szCs w:val="20"/>
-          <w:lang w:val="es-GT"/>
-        </w:rPr>
-        <w:t>El sistema muestra el botón “Iniciar Sesión”</w:t>
-      </w:r>
-    </w:p>
-    <w:p>
-      <w:pPr>
-        <w:pStyle w:val="Textoindependiente"/>
+          <w:iCs/>
+          <w:noProof/>
+          <w:sz w:val="20"/>
+          <w:szCs w:val="20"/>
+          <w:lang w:val="es-GT"/>
+        </w:rPr>
+      </w:pPr>
+      <w:r>
+        <w:rPr>
+          <w:rFonts w:ascii="Arial" w:hAnsi="Arial" w:cs="Arial"/>
+          <w:noProof/>
+          <w:sz w:val="20"/>
+          <w:szCs w:val="20"/>
+          <w:lang w:val="es-GT"/>
+        </w:rPr>
+        <w:t>El sistema muestra un mensaje indicando que el servicio no está disponible. AN02 No. 5</w:t>
+      </w:r>
+    </w:p>
+    <w:p>
+      <w:pPr>
+        <w:pStyle w:val="BodyText"/>
         <w:numPr>
           <w:ilvl w:val="0"/>
           <w:numId w:val="6"/>
@@ -2085,15 +1778,57 @@
           <w:szCs w:val="20"/>
           <w:lang w:val="es-GT"/>
         </w:rPr>
-        <w:t>El empleado municipal selecciona el botón “Iniciar sesión” CU-01</w:t>
-      </w:r>
-    </w:p>
-    <w:p>
-      <w:pPr>
-        <w:pStyle w:val="Textoindependiente"/>
+        <w:t>Fin del caso de uso</w:t>
+      </w:r>
+    </w:p>
+    <w:p>
+      <w:pPr>
+        <w:pStyle w:val="BodyText"/>
+        <w:ind w:left="1080"/>
+        <w:jc w:val="both"/>
+        <w:rPr>
+          <w:rFonts w:ascii="Arial" w:hAnsi="Arial" w:cs="Arial"/>
+          <w:noProof/>
+          <w:sz w:val="20"/>
+          <w:szCs w:val="20"/>
+          <w:lang w:val="es-GT"/>
+        </w:rPr>
+      </w:pPr>
+    </w:p>
+    <w:p>
+      <w:pPr>
+        <w:pStyle w:val="BodyText"/>
+        <w:ind w:left="360"/>
+        <w:jc w:val="both"/>
+        <w:rPr>
+          <w:rFonts w:ascii="Arial" w:hAnsi="Arial" w:cs="Arial"/>
+          <w:b/>
+          <w:bCs/>
+          <w:noProof/>
+          <w:sz w:val="20"/>
+          <w:szCs w:val="20"/>
+          <w:lang w:val="es-GT"/>
+        </w:rPr>
+      </w:pPr>
+      <w:r>
+        <w:rPr>
+          <w:rFonts w:ascii="Arial" w:hAnsi="Arial" w:cs="Arial"/>
+          <w:b/>
+          <w:bCs/>
+          <w:noProof/>
+          <w:sz w:val="20"/>
+          <w:szCs w:val="20"/>
+          <w:lang w:val="es-GT"/>
+        </w:rPr>
+        <w:t>FA03: El ciudadano Consulta el Estado del caso</w:t>
+      </w:r>
+    </w:p>
+    <w:p>
+      <w:pPr>
+        <w:pStyle w:val="BodyText"/>
         <w:numPr>
           <w:ilvl w:val="0"/>
-          <w:numId w:val="6"/>
+          <w:numId w:val="2"/>
         </w:numPr>
         <w:jc w:val="both"/>
         <w:rPr>
@@ -2112,13 +1847,199 @@
           <w:szCs w:val="20"/>
           <w:lang w:val="es-GT"/>
         </w:rPr>
+        <w:t xml:space="preserve">El sistema muestra el botón “consultar estado del caso”  </w:t>
+      </w:r>
+    </w:p>
+    <w:p>
+      <w:pPr>
+        <w:pStyle w:val="BodyText"/>
+        <w:numPr>
+          <w:ilvl w:val="0"/>
+          <w:numId w:val="2"/>
+        </w:numPr>
+        <w:jc w:val="both"/>
+        <w:rPr>
+          <w:rFonts w:ascii="Arial" w:hAnsi="Arial" w:cs="Arial"/>
+          <w:noProof/>
+          <w:sz w:val="20"/>
+          <w:szCs w:val="20"/>
+          <w:lang w:val="es-GT"/>
+        </w:rPr>
+      </w:pPr>
+      <w:r>
+        <w:rPr>
+          <w:rFonts w:ascii="Arial" w:hAnsi="Arial" w:cs="Arial"/>
+          <w:noProof/>
+          <w:sz w:val="20"/>
+          <w:szCs w:val="20"/>
+          <w:lang w:val="es-GT"/>
+        </w:rPr>
+        <w:lastRenderedPageBreak/>
+        <w:t>El ciudadano selecciona el botón “consultar estado del caso” CU-02</w:t>
+      </w:r>
+    </w:p>
+    <w:p>
+      <w:pPr>
+        <w:pStyle w:val="BodyText"/>
+        <w:numPr>
+          <w:ilvl w:val="0"/>
+          <w:numId w:val="2"/>
+        </w:numPr>
+        <w:jc w:val="both"/>
+        <w:rPr>
+          <w:rFonts w:ascii="Arial" w:hAnsi="Arial" w:cs="Arial"/>
+          <w:noProof/>
+          <w:sz w:val="20"/>
+          <w:szCs w:val="20"/>
+          <w:lang w:val="es-GT"/>
+        </w:rPr>
+      </w:pPr>
+      <w:r>
+        <w:rPr>
+          <w:rFonts w:ascii="Arial" w:hAnsi="Arial" w:cs="Arial"/>
+          <w:noProof/>
+          <w:sz w:val="20"/>
+          <w:szCs w:val="20"/>
+          <w:lang w:val="es-GT"/>
+        </w:rPr>
         <w:t>Fin del caso de uso</w:t>
       </w:r>
     </w:p>
     <w:p>
       <w:pPr>
-        <w:pStyle w:val="Textoindependiente"/>
-        <w:ind w:left="0"/>
+        <w:pStyle w:val="BodyText"/>
+        <w:ind w:left="1440"/>
+        <w:jc w:val="both"/>
+        <w:rPr>
+          <w:rFonts w:ascii="Arial" w:hAnsi="Arial" w:cs="Arial"/>
+          <w:noProof/>
+          <w:sz w:val="20"/>
+          <w:szCs w:val="20"/>
+          <w:lang w:val="es-GT"/>
+        </w:rPr>
+      </w:pPr>
+    </w:p>
+    <w:p>
+      <w:pPr>
+        <w:pStyle w:val="BodyText"/>
+        <w:jc w:val="both"/>
+        <w:rPr>
+          <w:rFonts w:ascii="Arial" w:hAnsi="Arial" w:cs="Arial"/>
+          <w:b/>
+          <w:bCs/>
+          <w:noProof/>
+          <w:sz w:val="20"/>
+          <w:szCs w:val="20"/>
+          <w:lang w:val="es-GT"/>
+        </w:rPr>
+      </w:pPr>
+      <w:r>
+        <w:rPr>
+          <w:rFonts w:ascii="Arial" w:hAnsi="Arial" w:cs="Arial"/>
+          <w:noProof/>
+          <w:sz w:val="20"/>
+          <w:szCs w:val="20"/>
+          <w:lang w:val="es-GT"/>
+        </w:rPr>
+        <w:t xml:space="preserve">       </w:t>
+      </w:r>
+      <w:r>
+        <w:rPr>
+          <w:rFonts w:ascii="Arial" w:hAnsi="Arial" w:cs="Arial"/>
+          <w:b/>
+          <w:bCs/>
+          <w:noProof/>
+          <w:sz w:val="20"/>
+          <w:szCs w:val="20"/>
+          <w:lang w:val="es-GT"/>
+        </w:rPr>
+        <w:t>FA04: Inicio de sesión</w:t>
+      </w:r>
+    </w:p>
+    <w:p>
+      <w:pPr>
+        <w:pStyle w:val="BodyText"/>
+        <w:numPr>
+          <w:ilvl w:val="0"/>
+          <w:numId w:val="1"/>
+        </w:numPr>
+        <w:jc w:val="both"/>
+        <w:rPr>
+          <w:rFonts w:ascii="Arial" w:hAnsi="Arial" w:cs="Arial"/>
+          <w:noProof/>
+          <w:sz w:val="20"/>
+          <w:szCs w:val="20"/>
+          <w:lang w:val="es-GT"/>
+        </w:rPr>
+      </w:pPr>
+      <w:r>
+        <w:rPr>
+          <w:rFonts w:ascii="Arial" w:hAnsi="Arial" w:cs="Arial"/>
+          <w:noProof/>
+          <w:sz w:val="20"/>
+          <w:szCs w:val="20"/>
+          <w:lang w:val="es-GT"/>
+        </w:rPr>
+        <w:t>El sistema muestra el botón “Iniciar Sesión”</w:t>
+      </w:r>
+    </w:p>
+    <w:p>
+      <w:pPr>
+        <w:pStyle w:val="BodyText"/>
+        <w:numPr>
+          <w:ilvl w:val="0"/>
+          <w:numId w:val="1"/>
+        </w:numPr>
+        <w:jc w:val="both"/>
+        <w:rPr>
+          <w:rFonts w:ascii="Arial" w:hAnsi="Arial" w:cs="Arial"/>
+          <w:noProof/>
+          <w:sz w:val="20"/>
+          <w:szCs w:val="20"/>
+          <w:lang w:val="es-GT"/>
+        </w:rPr>
+      </w:pPr>
+      <w:r>
+        <w:rPr>
+          <w:rFonts w:ascii="Arial" w:hAnsi="Arial" w:cs="Arial"/>
+          <w:noProof/>
+          <w:sz w:val="20"/>
+          <w:szCs w:val="20"/>
+          <w:lang w:val="es-GT"/>
+        </w:rPr>
+        <w:t>El empleado municipal selecciona el botón “Iniciar sesión” CU-01</w:t>
+      </w:r>
+    </w:p>
+    <w:p>
+      <w:pPr>
+        <w:pStyle w:val="BodyText"/>
+        <w:numPr>
+          <w:ilvl w:val="0"/>
+          <w:numId w:val="1"/>
+        </w:numPr>
+        <w:jc w:val="both"/>
+        <w:rPr>
+          <w:rFonts w:ascii="Arial" w:hAnsi="Arial" w:cs="Arial"/>
+          <w:noProof/>
+          <w:sz w:val="20"/>
+          <w:szCs w:val="20"/>
+          <w:lang w:val="es-GT"/>
+        </w:rPr>
+      </w:pPr>
+      <w:r>
+        <w:rPr>
+          <w:rFonts w:ascii="Arial" w:hAnsi="Arial" w:cs="Arial"/>
+          <w:noProof/>
+          <w:sz w:val="20"/>
+          <w:szCs w:val="20"/>
+          <w:lang w:val="es-GT"/>
+        </w:rPr>
+        <w:t>Fin del caso de uso</w:t>
+      </w:r>
+    </w:p>
+    <w:p>
+      <w:pPr>
+        <w:pStyle w:val="BodyText"/>
         <w:jc w:val="both"/>
         <w:rPr>
           <w:rFonts w:ascii="Arial" w:hAnsi="Arial" w:cs="Arial"/>
@@ -2134,7 +2055,7 @@
         <w:pStyle w:val="NormalWeb"/>
         <w:numPr>
           <w:ilvl w:val="1"/>
-          <w:numId w:val="1"/>
+          <w:numId w:val="3"/>
         </w:numPr>
         <w:spacing w:line="360" w:lineRule="auto"/>
         <w:ind w:right="300"/>
@@ -2150,21 +2071,20 @@
       <w:r>
         <w:rPr>
           <w:rFonts w:ascii="Arial" w:hAnsi="Arial" w:cs="Arial"/>
-          <w:b w:val="1"/>
-          <w:bCs w:val="1"/>
+          <w:b/>
+          <w:bCs/>
           <w:sz w:val="27"/>
           <w:szCs w:val="27"/>
-          <w:lang w:val="es-ES"/>
         </w:rPr>
         <w:t>Postcondiciones.</w:t>
       </w:r>
     </w:p>
     <w:p>
       <w:pPr>
-        <w:pStyle w:val="Textoindependiente"/>
+        <w:pStyle w:val="BodyText"/>
         <w:numPr>
           <w:ilvl w:val="2"/>
-          <w:numId w:val="1"/>
+          <w:numId w:val="3"/>
         </w:numPr>
         <w:spacing w:line="360" w:lineRule="auto"/>
         <w:ind w:left="1225" w:hanging="505"/>
@@ -2190,7 +2110,7 @@
         <w:pStyle w:val="NormalWeb"/>
         <w:numPr>
           <w:ilvl w:val="0"/>
-          <w:numId w:val="1"/>
+          <w:numId w:val="3"/>
         </w:numPr>
         <w:spacing w:line="360" w:lineRule="auto"/>
         <w:ind w:right="300"/>
@@ -2217,10 +2137,10 @@
     </w:p>
     <w:p>
       <w:pPr>
-        <w:pStyle w:val="Textoindependiente"/>
+        <w:pStyle w:val="BodyText"/>
         <w:numPr>
           <w:ilvl w:val="1"/>
-          <w:numId w:val="1"/>
+          <w:numId w:val="3"/>
         </w:numPr>
         <w:spacing w:line="360" w:lineRule="auto"/>
         <w:rPr>
@@ -2238,17 +2158,16 @@
           <w:noProof/>
           <w:sz w:val="20"/>
           <w:szCs w:val="20"/>
-          <w:lang w:val="es-ES"/>
         </w:rPr>
         <w:t>El formulario de autenticación deberá utilizar conexión segura HTTPS.</w:t>
       </w:r>
     </w:p>
     <w:p>
       <w:pPr>
-        <w:pStyle w:val="Textoindependiente"/>
+        <w:pStyle w:val="BodyText"/>
         <w:numPr>
           <w:ilvl w:val="1"/>
-          <w:numId w:val="1"/>
+          <w:numId w:val="3"/>
         </w:numPr>
         <w:spacing w:line="360" w:lineRule="auto"/>
         <w:rPr>
@@ -2277,7 +2196,7 @@
         <w:pStyle w:val="NormalWeb"/>
         <w:numPr>
           <w:ilvl w:val="0"/>
-          <w:numId w:val="1"/>
+          <w:numId w:val="3"/>
         </w:numPr>
         <w:spacing w:line="360" w:lineRule="auto"/>
         <w:ind w:right="300"/>
@@ -2308,10 +2227,10 @@
         <w:jc w:val="center"/>
         <w:tblCellSpacing w:w="0" w:type="dxa"/>
         <w:tblBorders>
-          <w:top w:val="outset" w:color="000000" w:sz="6" w:space="0"/>
-          <w:left w:val="outset" w:color="000000" w:sz="6" w:space="0"/>
-          <w:bottom w:val="outset" w:color="000000" w:sz="6" w:space="0"/>
-          <w:right w:val="outset" w:color="000000" w:sz="6" w:space="0"/>
+          <w:top w:val="outset" w:sz="6" w:space="0" w:color="000000"/>
+          <w:left w:val="outset" w:sz="6" w:space="0" w:color="000000"/>
+          <w:bottom w:val="outset" w:sz="6" w:space="0" w:color="000000"/>
+          <w:right w:val="outset" w:sz="6" w:space="0" w:color="000000"/>
         </w:tblBorders>
         <w:tblCellMar>
           <w:left w:w="0" w:type="dxa"/>
@@ -2334,10 +2253,10 @@
           <w:tcPr>
             <w:tcW w:w="3086" w:type="dxa"/>
             <w:tcBorders>
-              <w:top w:val="outset" w:color="000000" w:sz="6" w:space="0"/>
-              <w:left w:val="outset" w:color="000000" w:sz="6" w:space="0"/>
-              <w:bottom w:val="outset" w:color="000000" w:sz="6" w:space="0"/>
-              <w:right w:val="outset" w:color="000000" w:sz="6" w:space="0"/>
+              <w:top w:val="outset" w:sz="6" w:space="0" w:color="000000"/>
+              <w:left w:val="outset" w:sz="6" w:space="0" w:color="000000"/>
+              <w:bottom w:val="outset" w:sz="6" w:space="0" w:color="000000"/>
+              <w:right w:val="outset" w:sz="6" w:space="0" w:color="000000"/>
             </w:tcBorders>
             <w:vAlign w:val="center"/>
           </w:tcPr>
@@ -2370,10 +2289,10 @@
           <w:tcPr>
             <w:tcW w:w="3375" w:type="dxa"/>
             <w:tcBorders>
-              <w:top w:val="outset" w:color="000000" w:sz="6" w:space="0"/>
-              <w:left w:val="outset" w:color="000000" w:sz="6" w:space="0"/>
-              <w:bottom w:val="outset" w:color="000000" w:sz="6" w:space="0"/>
-              <w:right w:val="outset" w:color="000000" w:sz="6" w:space="0"/>
+              <w:top w:val="outset" w:sz="6" w:space="0" w:color="000000"/>
+              <w:left w:val="outset" w:sz="6" w:space="0" w:color="000000"/>
+              <w:bottom w:val="outset" w:sz="6" w:space="0" w:color="000000"/>
+              <w:right w:val="outset" w:sz="6" w:space="0" w:color="000000"/>
             </w:tcBorders>
             <w:vAlign w:val="center"/>
           </w:tcPr>
@@ -2399,10 +2318,10 @@
           <w:tcPr>
             <w:tcW w:w="2539" w:type="dxa"/>
             <w:tcBorders>
-              <w:top w:val="outset" w:color="000000" w:sz="6" w:space="0"/>
-              <w:left w:val="outset" w:color="000000" w:sz="6" w:space="0"/>
-              <w:bottom w:val="outset" w:color="000000" w:sz="6" w:space="0"/>
-              <w:right w:val="outset" w:color="000000" w:sz="6" w:space="0"/>
+              <w:top w:val="outset" w:sz="6" w:space="0" w:color="000000"/>
+              <w:left w:val="outset" w:sz="6" w:space="0" w:color="000000"/>
+              <w:bottom w:val="outset" w:sz="6" w:space="0" w:color="000000"/>
+              <w:right w:val="outset" w:sz="6" w:space="0" w:color="000000"/>
             </w:tcBorders>
             <w:vAlign w:val="center"/>
           </w:tcPr>
@@ -2435,10 +2354,10 @@
           <w:tcPr>
             <w:tcW w:w="3086" w:type="dxa"/>
             <w:tcBorders>
-              <w:top w:val="outset" w:color="000000" w:sz="6" w:space="0"/>
-              <w:left w:val="outset" w:color="000000" w:sz="6" w:space="0"/>
-              <w:bottom w:val="outset" w:color="000000" w:sz="6" w:space="0"/>
-              <w:right w:val="outset" w:color="000000" w:sz="6" w:space="0"/>
+              <w:top w:val="outset" w:sz="6" w:space="0" w:color="000000"/>
+              <w:left w:val="outset" w:sz="6" w:space="0" w:color="000000"/>
+              <w:bottom w:val="outset" w:sz="6" w:space="0" w:color="000000"/>
+              <w:right w:val="outset" w:sz="6" w:space="0" w:color="000000"/>
             </w:tcBorders>
             <w:vAlign w:val="center"/>
           </w:tcPr>
@@ -2455,10 +2374,10 @@
           <w:tcPr>
             <w:tcW w:w="3375" w:type="dxa"/>
             <w:tcBorders>
-              <w:top w:val="outset" w:color="000000" w:sz="6" w:space="0"/>
-              <w:left w:val="outset" w:color="000000" w:sz="6" w:space="0"/>
-              <w:bottom w:val="outset" w:color="000000" w:sz="6" w:space="0"/>
-              <w:right w:val="outset" w:color="000000" w:sz="6" w:space="0"/>
+              <w:top w:val="outset" w:sz="6" w:space="0" w:color="000000"/>
+              <w:left w:val="outset" w:sz="6" w:space="0" w:color="000000"/>
+              <w:bottom w:val="outset" w:sz="6" w:space="0" w:color="000000"/>
+              <w:right w:val="outset" w:sz="6" w:space="0" w:color="000000"/>
             </w:tcBorders>
             <w:vAlign w:val="center"/>
           </w:tcPr>
@@ -2472,10 +2391,10 @@
           <w:tcPr>
             <w:tcW w:w="2539" w:type="dxa"/>
             <w:tcBorders>
-              <w:top w:val="outset" w:color="000000" w:sz="6" w:space="0"/>
-              <w:left w:val="outset" w:color="000000" w:sz="6" w:space="0"/>
-              <w:bottom w:val="outset" w:color="000000" w:sz="6" w:space="0"/>
-              <w:right w:val="outset" w:color="000000" w:sz="6" w:space="0"/>
+              <w:top w:val="outset" w:sz="6" w:space="0" w:color="000000"/>
+              <w:left w:val="outset" w:sz="6" w:space="0" w:color="000000"/>
+              <w:bottom w:val="outset" w:sz="6" w:space="0" w:color="000000"/>
+              <w:right w:val="outset" w:sz="6" w:space="0" w:color="000000"/>
             </w:tcBorders>
             <w:vAlign w:val="center"/>
           </w:tcPr>
@@ -2496,10 +2415,10 @@
           <w:tcPr>
             <w:tcW w:w="3086" w:type="dxa"/>
             <w:tcBorders>
-              <w:top w:val="outset" w:color="000000" w:sz="6" w:space="0"/>
-              <w:left w:val="outset" w:color="000000" w:sz="6" w:space="0"/>
-              <w:bottom w:val="outset" w:color="000000" w:sz="6" w:space="0"/>
-              <w:right w:val="outset" w:color="000000" w:sz="6" w:space="0"/>
+              <w:top w:val="outset" w:sz="6" w:space="0" w:color="000000"/>
+              <w:left w:val="outset" w:sz="6" w:space="0" w:color="000000"/>
+              <w:bottom w:val="outset" w:sz="6" w:space="0" w:color="000000"/>
+              <w:right w:val="outset" w:sz="6" w:space="0" w:color="000000"/>
             </w:tcBorders>
             <w:vAlign w:val="center"/>
           </w:tcPr>
@@ -2513,10 +2432,10 @@
           <w:tcPr>
             <w:tcW w:w="3375" w:type="dxa"/>
             <w:tcBorders>
-              <w:top w:val="outset" w:color="000000" w:sz="6" w:space="0"/>
-              <w:left w:val="outset" w:color="000000" w:sz="6" w:space="0"/>
-              <w:bottom w:val="outset" w:color="000000" w:sz="6" w:space="0"/>
-              <w:right w:val="outset" w:color="000000" w:sz="6" w:space="0"/>
+              <w:top w:val="outset" w:sz="6" w:space="0" w:color="000000"/>
+              <w:left w:val="outset" w:sz="6" w:space="0" w:color="000000"/>
+              <w:bottom w:val="outset" w:sz="6" w:space="0" w:color="000000"/>
+              <w:right w:val="outset" w:sz="6" w:space="0" w:color="000000"/>
             </w:tcBorders>
             <w:vAlign w:val="center"/>
           </w:tcPr>
@@ -2530,10 +2449,10 @@
           <w:tcPr>
             <w:tcW w:w="2539" w:type="dxa"/>
             <w:tcBorders>
-              <w:top w:val="outset" w:color="000000" w:sz="6" w:space="0"/>
-              <w:left w:val="outset" w:color="000000" w:sz="6" w:space="0"/>
-              <w:bottom w:val="outset" w:color="000000" w:sz="6" w:space="0"/>
-              <w:right w:val="outset" w:color="000000" w:sz="6" w:space="0"/>
+              <w:top w:val="outset" w:sz="6" w:space="0" w:color="000000"/>
+              <w:left w:val="outset" w:sz="6" w:space="0" w:color="000000"/>
+              <w:bottom w:val="outset" w:sz="6" w:space="0" w:color="000000"/>
+              <w:right w:val="outset" w:sz="6" w:space="0" w:color="000000"/>
             </w:tcBorders>
             <w:vAlign w:val="center"/>
           </w:tcPr>
@@ -2548,7 +2467,7 @@
     </w:tbl>
     <w:p>
       <w:pPr>
-        <w:pStyle w:val="Ttulo1"/>
+        <w:pStyle w:val="Heading1"/>
         <w:spacing w:line="360" w:lineRule="auto"/>
         <w:ind w:right="300"/>
         <w:rPr>
@@ -2561,10 +2480,10 @@
     </w:p>
     <w:p/>
     <w:sectPr>
-      <w:pgSz w:w="11906" w:h="16838" w:orient="portrait"/>
+      <w:pgSz w:w="11906" w:h="16838"/>
       <w:pgMar w:top="1417" w:right="1701" w:bottom="1417" w:left="1701" w:header="283" w:footer="283" w:gutter="0"/>
       <w:pgBorders w:offsetFrom="page">
-        <w:bottom w:val="single" w:color="auto" w:sz="6" w:space="24"/>
+        <w:bottom w:val="single" w:sz="6" w:space="24" w:color="auto"/>
       </w:pgBorders>
       <w:cols w:space="708"/>
       <w:titlePg/>
@@ -2575,177 +2494,7 @@
 </file>
 
 <file path=word/numbering.xml><?xml version="1.0" encoding="utf-8"?>
-<w:numbering xmlns:wpc="http://schemas.microsoft.com/office/word/2010/wordprocessingCanvas" xmlns:cx="http://schemas.microsoft.com/office/drawing/2014/chartex" xmlns:cx1="http://schemas.microsoft.com/office/drawing/2015/9/8/chartex" xmlns:cx2="http://schemas.microsoft.com/office/drawing/2015/10/21/chartex" xmlns:cx3="http://schemas.microsoft.com/office/drawing/2016/5/9/chartex" xmlns:cx4="http://schemas.microsoft.com/office/drawing/2016/5/10/chartex" xmlns:cx5="http://schemas.microsoft.com/office/drawing/2016/5/11/chartex" xmlns:cx6="http://schemas.microsoft.com/office/drawing/2016/5/12/chartex" xmlns:cx7="http://schemas.microsoft.com/office/drawing/2016/5/13/chartex" xmlns:cx8="http://schemas.microsoft.com/office/drawing/2016/5/14/chartex" xmlns:mc="http://schemas.openxmlformats.org/markup-compatibility/2006" xmlns:aink="http://schemas.microsoft.com/office/drawing/2016/ink" xmlns:am3d="http://schemas.microsoft.com/office/drawing/2017/model3d" xmlns:o="urn:schemas-microsoft-com:office:office" xmlns:oel="http://schemas.microsoft.com/office/2019/extlst" xmlns:r="http://schemas.openxmlformats.org/officeDocument/2006/relationships" xmlns:m="http://schemas.openxmlformats.org/officeDocument/2006/math" xmlns:v="urn:schemas-microsoft-com:vml" xmlns:wp14="http://schemas.microsoft.com/office/word/2010/wordprocessingDrawing" xmlns:wp="http://schemas.openxmlformats.org/drawingml/2006/wordprocessingDrawing" xmlns:w10="urn:schemas-microsoft-com:office:word" xmlns:w="http://schemas.openxmlformats.org/wordprocessingml/2006/main" xmlns:w14="http://schemas.microsoft.com/office/word/2010/wordml" xmlns:w15="http://schemas.microsoft.com/office/word/2012/wordml" xmlns:w16cex="http://schemas.microsoft.com/office/word/2018/wordml/cex" xmlns:w16cid="http://schemas.microsoft.com/office/word/2016/wordml/cid" xmlns:w16="http://schemas.microsoft.com/office/word/2018/wordml" xmlns:w16du="http://schemas.microsoft.com/office/word/2023/wordml/word16du" xmlns:w16sdtdh="http://schemas.microsoft.com/office/word/2020/wordml/sdtdatahash" xmlns:w16sdtfl="http://schemas.microsoft.com/office/word/2024/wordml/sdtformatlock" xmlns:w16se="http://schemas.microsoft.com/office/word/2015/wordml/symex" xmlns:wpg="http://schemas.microsoft.com/office/word/2010/wordprocessingGroup" xmlns:wpi="http://schemas.microsoft.com/office/word/2010/wordprocessingInk" xmlns:wne="http://schemas.microsoft.com/office/word/2006/wordml" xmlns:wps="http://schemas.microsoft.com/office/word/2010/wordprocessingShape" mc:Ignorable="w14 w15 w16se w16cid w16 w16cex w16sdtdh w16sdtfl w16du wp14">
-  <w:abstractNum xmlns:w="http://schemas.openxmlformats.org/wordprocessingml/2006/main" w:abstractNumId="5">
-    <w:nsid w:val="148f8576"/>
-    <w:multiLevelType xmlns:w="http://schemas.openxmlformats.org/wordprocessingml/2006/main" w:val="hybridMultilevel"/>
-    <w:lvl xmlns:w="http://schemas.openxmlformats.org/wordprocessingml/2006/main" w:ilvl="0">
-      <w:start w:val="1"/>
-      <w:numFmt w:val="decimal"/>
-      <w:lvlText w:val="%1."/>
-      <w:lvlJc w:val="left"/>
-      <w:pPr>
-        <w:ind w:left="1440" w:hanging="360"/>
-      </w:pPr>
-    </w:lvl>
-    <w:lvl xmlns:w="http://schemas.openxmlformats.org/wordprocessingml/2006/main" w:ilvl="1">
-      <w:start w:val="1"/>
-      <w:numFmt w:val="lowerLetter"/>
-      <w:lvlText w:val="%2."/>
-      <w:lvlJc w:val="left"/>
-      <w:pPr>
-        <w:ind w:left="2160" w:hanging="360"/>
-      </w:pPr>
-    </w:lvl>
-    <w:lvl xmlns:w="http://schemas.openxmlformats.org/wordprocessingml/2006/main" w:ilvl="2">
-      <w:start w:val="1"/>
-      <w:numFmt w:val="lowerRoman"/>
-      <w:lvlText w:val="%3."/>
-      <w:lvlJc w:val="right"/>
-      <w:pPr>
-        <w:ind w:left="2880" w:hanging="180"/>
-      </w:pPr>
-    </w:lvl>
-    <w:lvl xmlns:w="http://schemas.openxmlformats.org/wordprocessingml/2006/main" w:ilvl="3">
-      <w:start w:val="1"/>
-      <w:numFmt w:val="decimal"/>
-      <w:lvlText w:val="%4."/>
-      <w:lvlJc w:val="left"/>
-      <w:pPr>
-        <w:ind w:left="3600" w:hanging="360"/>
-      </w:pPr>
-    </w:lvl>
-    <w:lvl xmlns:w="http://schemas.openxmlformats.org/wordprocessingml/2006/main" w:ilvl="4">
-      <w:start w:val="1"/>
-      <w:numFmt w:val="lowerLetter"/>
-      <w:lvlText w:val="%5."/>
-      <w:lvlJc w:val="left"/>
-      <w:pPr>
-        <w:ind w:left="4320" w:hanging="360"/>
-      </w:pPr>
-    </w:lvl>
-    <w:lvl xmlns:w="http://schemas.openxmlformats.org/wordprocessingml/2006/main" w:ilvl="5">
-      <w:start w:val="1"/>
-      <w:numFmt w:val="lowerRoman"/>
-      <w:lvlText w:val="%6."/>
-      <w:lvlJc w:val="right"/>
-      <w:pPr>
-        <w:ind w:left="5040" w:hanging="180"/>
-      </w:pPr>
-    </w:lvl>
-    <w:lvl xmlns:w="http://schemas.openxmlformats.org/wordprocessingml/2006/main" w:ilvl="6">
-      <w:start w:val="1"/>
-      <w:numFmt w:val="decimal"/>
-      <w:lvlText w:val="%7."/>
-      <w:lvlJc w:val="left"/>
-      <w:pPr>
-        <w:ind w:left="5760" w:hanging="360"/>
-      </w:pPr>
-    </w:lvl>
-    <w:lvl xmlns:w="http://schemas.openxmlformats.org/wordprocessingml/2006/main" w:ilvl="7">
-      <w:start w:val="1"/>
-      <w:numFmt w:val="lowerLetter"/>
-      <w:lvlText w:val="%8."/>
-      <w:lvlJc w:val="left"/>
-      <w:pPr>
-        <w:ind w:left="6480" w:hanging="360"/>
-      </w:pPr>
-    </w:lvl>
-    <w:lvl xmlns:w="http://schemas.openxmlformats.org/wordprocessingml/2006/main" w:ilvl="8">
-      <w:start w:val="1"/>
-      <w:numFmt w:val="lowerRoman"/>
-      <w:lvlText w:val="%9."/>
-      <w:lvlJc w:val="right"/>
-      <w:pPr>
-        <w:ind w:left="7200" w:hanging="180"/>
-      </w:pPr>
-    </w:lvl>
-  </w:abstractNum>
-  <w:abstractNum xmlns:w="http://schemas.openxmlformats.org/wordprocessingml/2006/main" w:abstractNumId="4">
-    <w:nsid w:val="7c2bdbae"/>
-    <w:multiLevelType xmlns:w="http://schemas.openxmlformats.org/wordprocessingml/2006/main" w:val="hybridMultilevel"/>
-    <w:lvl xmlns:w="http://schemas.openxmlformats.org/wordprocessingml/2006/main" w:ilvl="0">
-      <w:start w:val="1"/>
-      <w:numFmt w:val="decimal"/>
-      <w:lvlText w:val="%1."/>
-      <w:lvlJc w:val="left"/>
-      <w:pPr>
-        <w:ind w:left="1440" w:hanging="360"/>
-      </w:pPr>
-    </w:lvl>
-    <w:lvl xmlns:w="http://schemas.openxmlformats.org/wordprocessingml/2006/main" w:ilvl="1">
-      <w:start w:val="1"/>
-      <w:numFmt w:val="lowerLetter"/>
-      <w:lvlText w:val="%2."/>
-      <w:lvlJc w:val="left"/>
-      <w:pPr>
-        <w:ind w:left="2160" w:hanging="360"/>
-      </w:pPr>
-    </w:lvl>
-    <w:lvl xmlns:w="http://schemas.openxmlformats.org/wordprocessingml/2006/main" w:ilvl="2">
-      <w:start w:val="1"/>
-      <w:numFmt w:val="lowerRoman"/>
-      <w:lvlText w:val="%3."/>
-      <w:lvlJc w:val="right"/>
-      <w:pPr>
-        <w:ind w:left="2880" w:hanging="180"/>
-      </w:pPr>
-    </w:lvl>
-    <w:lvl xmlns:w="http://schemas.openxmlformats.org/wordprocessingml/2006/main" w:ilvl="3">
-      <w:start w:val="1"/>
-      <w:numFmt w:val="decimal"/>
-      <w:lvlText w:val="%4."/>
-      <w:lvlJc w:val="left"/>
-      <w:pPr>
-        <w:ind w:left="3600" w:hanging="360"/>
-      </w:pPr>
-    </w:lvl>
-    <w:lvl xmlns:w="http://schemas.openxmlformats.org/wordprocessingml/2006/main" w:ilvl="4">
-      <w:start w:val="1"/>
-      <w:numFmt w:val="lowerLetter"/>
-      <w:lvlText w:val="%5."/>
-      <w:lvlJc w:val="left"/>
-      <w:pPr>
-        <w:ind w:left="4320" w:hanging="360"/>
-      </w:pPr>
-    </w:lvl>
-    <w:lvl xmlns:w="http://schemas.openxmlformats.org/wordprocessingml/2006/main" w:ilvl="5">
-      <w:start w:val="1"/>
-      <w:numFmt w:val="lowerRoman"/>
-      <w:lvlText w:val="%6."/>
-      <w:lvlJc w:val="right"/>
-      <w:pPr>
-        <w:ind w:left="5040" w:hanging="180"/>
-      </w:pPr>
-    </w:lvl>
-    <w:lvl xmlns:w="http://schemas.openxmlformats.org/wordprocessingml/2006/main" w:ilvl="6">
-      <w:start w:val="1"/>
-      <w:numFmt w:val="decimal"/>
-      <w:lvlText w:val="%7."/>
-      <w:lvlJc w:val="left"/>
-      <w:pPr>
-        <w:ind w:left="5760" w:hanging="360"/>
-      </w:pPr>
-    </w:lvl>
-    <w:lvl xmlns:w="http://schemas.openxmlformats.org/wordprocessingml/2006/main" w:ilvl="7">
-      <w:start w:val="1"/>
-      <w:numFmt w:val="lowerLetter"/>
-      <w:lvlText w:val="%8."/>
-      <w:lvlJc w:val="left"/>
-      <w:pPr>
-        <w:ind w:left="6480" w:hanging="360"/>
-      </w:pPr>
-    </w:lvl>
-    <w:lvl xmlns:w="http://schemas.openxmlformats.org/wordprocessingml/2006/main" w:ilvl="8">
-      <w:start w:val="1"/>
-      <w:numFmt w:val="lowerRoman"/>
-      <w:lvlText w:val="%9."/>
-      <w:lvlJc w:val="right"/>
-      <w:pPr>
-        <w:ind w:left="7200" w:hanging="180"/>
-      </w:pPr>
-    </w:lvl>
-  </w:abstractNum>
+<w:numbering xmlns:wpc="http://schemas.microsoft.com/office/word/2010/wordprocessingCanvas" xmlns:cx="http://schemas.microsoft.com/office/drawing/2014/chartex" xmlns:cx1="http://schemas.microsoft.com/office/drawing/2015/9/8/chartex" xmlns:cx2="http://schemas.microsoft.com/office/drawing/2015/10/21/chartex" xmlns:cx3="http://schemas.microsoft.com/office/drawing/2016/5/9/chartex" xmlns:cx4="http://schemas.microsoft.com/office/drawing/2016/5/10/chartex" xmlns:cx5="http://schemas.microsoft.com/office/drawing/2016/5/11/chartex" xmlns:cx6="http://schemas.microsoft.com/office/drawing/2016/5/12/chartex" xmlns:cx7="http://schemas.microsoft.com/office/drawing/2016/5/13/chartex" xmlns:cx8="http://schemas.microsoft.com/office/drawing/2016/5/14/chartex" xmlns:mc="http://schemas.openxmlformats.org/markup-compatibility/2006" xmlns:aink="http://schemas.microsoft.com/office/drawing/2016/ink" xmlns:am3d="http://schemas.microsoft.com/office/drawing/2017/model3d" xmlns:o="urn:schemas-microsoft-com:office:office" xmlns:r="http://schemas.openxmlformats.org/officeDocument/2006/relationships" xmlns:m="http://schemas.openxmlformats.org/officeDocument/2006/math" xmlns:v="urn:schemas-microsoft-com:vml" xmlns:wp14="http://schemas.microsoft.com/office/word/2010/wordprocessingDrawing" xmlns:wp="http://schemas.openxmlformats.org/drawingml/2006/wordprocessingDrawing" xmlns:w10="urn:schemas-microsoft-com:office:word" xmlns:w="http://schemas.openxmlformats.org/wordprocessingml/2006/main" xmlns:w14="http://schemas.microsoft.com/office/word/2010/wordml" xmlns:w15="http://schemas.microsoft.com/office/word/2012/wordml" xmlns:w16cex="http://schemas.microsoft.com/office/word/2018/wordml/cex" xmlns:w16cid="http://schemas.microsoft.com/office/word/2016/wordml/cid" xmlns:w16="http://schemas.microsoft.com/office/word/2018/wordml" xmlns:w16sdtdh="http://schemas.microsoft.com/office/word/2020/wordml/sdtdatahash" xmlns:w16se="http://schemas.microsoft.com/office/word/2015/wordml/symex" xmlns:wpg="http://schemas.microsoft.com/office/word/2010/wordprocessingGroup" xmlns:wpi="http://schemas.microsoft.com/office/word/2010/wordprocessingInk" xmlns:wne="http://schemas.microsoft.com/office/word/2006/wordml" xmlns:wps="http://schemas.microsoft.com/office/word/2010/wordprocessingShape" mc:Ignorable="w14 w15 w16se w16cid w16 w16cex w16sdtdh wp14">
   <w:abstractNum w:abstractNumId="0" w15:restartNumberingAfterBreak="0">
     <w:nsid w:val="02F81A67"/>
     <w:multiLevelType w:val="multilevel"/>
@@ -2860,6 +2609,92 @@
     </w:lvl>
   </w:abstractNum>
   <w:abstractNum w:abstractNumId="1" w15:restartNumberingAfterBreak="0">
+    <w:nsid w:val="148F8576"/>
+    <w:multiLevelType w:val="hybridMultilevel"/>
+    <w:tmpl w:val="9B6CE85E"/>
+    <w:lvl w:ilvl="0" w:tplc="D9E272B8">
+      <w:start w:val="1"/>
+      <w:numFmt w:val="decimal"/>
+      <w:lvlText w:val="%1."/>
+      <w:lvlJc w:val="left"/>
+      <w:pPr>
+        <w:ind w:left="1440" w:hanging="360"/>
+      </w:pPr>
+    </w:lvl>
+    <w:lvl w:ilvl="1" w:tplc="6A70C576">
+      <w:start w:val="1"/>
+      <w:numFmt w:val="lowerLetter"/>
+      <w:lvlText w:val="%2."/>
+      <w:lvlJc w:val="left"/>
+      <w:pPr>
+        <w:ind w:left="2160" w:hanging="360"/>
+      </w:pPr>
+    </w:lvl>
+    <w:lvl w:ilvl="2" w:tplc="DB7A7D14">
+      <w:start w:val="1"/>
+      <w:numFmt w:val="lowerRoman"/>
+      <w:lvlText w:val="%3."/>
+      <w:lvlJc w:val="right"/>
+      <w:pPr>
+        <w:ind w:left="2880" w:hanging="180"/>
+      </w:pPr>
+    </w:lvl>
+    <w:lvl w:ilvl="3" w:tplc="EA9C0028">
+      <w:start w:val="1"/>
+      <w:numFmt w:val="decimal"/>
+      <w:lvlText w:val="%4."/>
+      <w:lvlJc w:val="left"/>
+      <w:pPr>
+        <w:ind w:left="3600" w:hanging="360"/>
+      </w:pPr>
+    </w:lvl>
+    <w:lvl w:ilvl="4" w:tplc="71EAB510">
+      <w:start w:val="1"/>
+      <w:numFmt w:val="lowerLetter"/>
+      <w:lvlText w:val="%5."/>
+      <w:lvlJc w:val="left"/>
+      <w:pPr>
+        <w:ind w:left="4320" w:hanging="360"/>
+      </w:pPr>
+    </w:lvl>
+    <w:lvl w:ilvl="5" w:tplc="947E4A44">
+      <w:start w:val="1"/>
+      <w:numFmt w:val="lowerRoman"/>
+      <w:lvlText w:val="%6."/>
+      <w:lvlJc w:val="right"/>
+      <w:pPr>
+        <w:ind w:left="5040" w:hanging="180"/>
+      </w:pPr>
+    </w:lvl>
+    <w:lvl w:ilvl="6" w:tplc="676648F4">
+      <w:start w:val="1"/>
+      <w:numFmt w:val="decimal"/>
+      <w:lvlText w:val="%7."/>
+      <w:lvlJc w:val="left"/>
+      <w:pPr>
+        <w:ind w:left="5760" w:hanging="360"/>
+      </w:pPr>
+    </w:lvl>
+    <w:lvl w:ilvl="7" w:tplc="4D4E1008">
+      <w:start w:val="1"/>
+      <w:numFmt w:val="lowerLetter"/>
+      <w:lvlText w:val="%8."/>
+      <w:lvlJc w:val="left"/>
+      <w:pPr>
+        <w:ind w:left="6480" w:hanging="360"/>
+      </w:pPr>
+    </w:lvl>
+    <w:lvl w:ilvl="8" w:tplc="64EAEC5E">
+      <w:start w:val="1"/>
+      <w:numFmt w:val="lowerRoman"/>
+      <w:lvlText w:val="%9."/>
+      <w:lvlJc w:val="right"/>
+      <w:pPr>
+        <w:ind w:left="7200" w:hanging="180"/>
+      </w:pPr>
+    </w:lvl>
+  </w:abstractNum>
+  <w:abstractNum w:abstractNumId="2" w15:restartNumberingAfterBreak="0">
     <w:nsid w:val="2AE4377D"/>
     <w:multiLevelType w:val="hybridMultilevel"/>
     <w:tmpl w:val="806E7E2E"/>
@@ -2945,7 +2780,7 @@
       </w:pPr>
     </w:lvl>
   </w:abstractNum>
-  <w:abstractNum w:abstractNumId="2" w15:restartNumberingAfterBreak="0">
+  <w:abstractNum w:abstractNumId="3" w15:restartNumberingAfterBreak="0">
     <w:nsid w:val="40A11EFA"/>
     <w:multiLevelType w:val="hybridMultilevel"/>
     <w:tmpl w:val="1F0447DC"/>
@@ -3031,7 +2866,7 @@
       </w:pPr>
     </w:lvl>
   </w:abstractNum>
-  <w:abstractNum w:abstractNumId="3" w15:restartNumberingAfterBreak="0">
+  <w:abstractNum w:abstractNumId="4" w15:restartNumberingAfterBreak="0">
     <w:nsid w:val="6A4361E2"/>
     <w:multiLevelType w:val="hybridMultilevel"/>
     <w:tmpl w:val="DB24ABE0"/>
@@ -3117,33 +2952,119 @@
       </w:pPr>
     </w:lvl>
   </w:abstractNum>
-  <w:num w:numId="6">
+  <w:abstractNum w:abstractNumId="5" w15:restartNumberingAfterBreak="0">
+    <w:nsid w:val="7C2BDBAE"/>
+    <w:multiLevelType w:val="hybridMultilevel"/>
+    <w:tmpl w:val="5074E48E"/>
+    <w:lvl w:ilvl="0" w:tplc="CD027AC6">
+      <w:start w:val="1"/>
+      <w:numFmt w:val="decimal"/>
+      <w:lvlText w:val="%1."/>
+      <w:lvlJc w:val="left"/>
+      <w:pPr>
+        <w:ind w:left="1440" w:hanging="360"/>
+      </w:pPr>
+    </w:lvl>
+    <w:lvl w:ilvl="1" w:tplc="8452C8F2">
+      <w:start w:val="1"/>
+      <w:numFmt w:val="lowerLetter"/>
+      <w:lvlText w:val="%2."/>
+      <w:lvlJc w:val="left"/>
+      <w:pPr>
+        <w:ind w:left="2160" w:hanging="360"/>
+      </w:pPr>
+    </w:lvl>
+    <w:lvl w:ilvl="2" w:tplc="837CC2BE">
+      <w:start w:val="1"/>
+      <w:numFmt w:val="lowerRoman"/>
+      <w:lvlText w:val="%3."/>
+      <w:lvlJc w:val="right"/>
+      <w:pPr>
+        <w:ind w:left="2880" w:hanging="180"/>
+      </w:pPr>
+    </w:lvl>
+    <w:lvl w:ilvl="3" w:tplc="8CA625A4">
+      <w:start w:val="1"/>
+      <w:numFmt w:val="decimal"/>
+      <w:lvlText w:val="%4."/>
+      <w:lvlJc w:val="left"/>
+      <w:pPr>
+        <w:ind w:left="3600" w:hanging="360"/>
+      </w:pPr>
+    </w:lvl>
+    <w:lvl w:ilvl="4" w:tplc="9170EBC0">
+      <w:start w:val="1"/>
+      <w:numFmt w:val="lowerLetter"/>
+      <w:lvlText w:val="%5."/>
+      <w:lvlJc w:val="left"/>
+      <w:pPr>
+        <w:ind w:left="4320" w:hanging="360"/>
+      </w:pPr>
+    </w:lvl>
+    <w:lvl w:ilvl="5" w:tplc="EA601A5E">
+      <w:start w:val="1"/>
+      <w:numFmt w:val="lowerRoman"/>
+      <w:lvlText w:val="%6."/>
+      <w:lvlJc w:val="right"/>
+      <w:pPr>
+        <w:ind w:left="5040" w:hanging="180"/>
+      </w:pPr>
+    </w:lvl>
+    <w:lvl w:ilvl="6" w:tplc="C6E6DC02">
+      <w:start w:val="1"/>
+      <w:numFmt w:val="decimal"/>
+      <w:lvlText w:val="%7."/>
+      <w:lvlJc w:val="left"/>
+      <w:pPr>
+        <w:ind w:left="5760" w:hanging="360"/>
+      </w:pPr>
+    </w:lvl>
+    <w:lvl w:ilvl="7" w:tplc="E1007160">
+      <w:start w:val="1"/>
+      <w:numFmt w:val="lowerLetter"/>
+      <w:lvlText w:val="%8."/>
+      <w:lvlJc w:val="left"/>
+      <w:pPr>
+        <w:ind w:left="6480" w:hanging="360"/>
+      </w:pPr>
+    </w:lvl>
+    <w:lvl w:ilvl="8" w:tplc="E56AA3A6">
+      <w:start w:val="1"/>
+      <w:numFmt w:val="lowerRoman"/>
+      <w:lvlText w:val="%9."/>
+      <w:lvlJc w:val="right"/>
+      <w:pPr>
+        <w:ind w:left="7200" w:hanging="180"/>
+      </w:pPr>
+    </w:lvl>
+  </w:abstractNum>
+  <w:num w:numId="1">
+    <w:abstractNumId w:val="1"/>
+  </w:num>
+  <w:num w:numId="2">
     <w:abstractNumId w:val="5"/>
+  </w:num>
+  <w:num w:numId="3">
+    <w:abstractNumId w:val="0"/>
+  </w:num>
+  <w:num w:numId="4">
+    <w:abstractNumId w:val="3"/>
   </w:num>
   <w:num w:numId="5">
     <w:abstractNumId w:val="4"/>
   </w:num>
-  <w:num w:numId="1" w16cid:durableId="1465387613">
-    <w:abstractNumId w:val="0"/>
-  </w:num>
-  <w:num w:numId="2" w16cid:durableId="427431371">
+  <w:num w:numId="6">
     <w:abstractNumId w:val="2"/>
-  </w:num>
-  <w:num w:numId="3" w16cid:durableId="1391614267">
-    <w:abstractNumId w:val="3"/>
-  </w:num>
-  <w:num w:numId="4" w16cid:durableId="1227571428">
-    <w:abstractNumId w:val="1"/>
   </w:num>
 </w:numbering>
 </file>
 
 <file path=word/styles.xml><?xml version="1.0" encoding="utf-8"?>
-<w:styles xmlns:mc="http://schemas.openxmlformats.org/markup-compatibility/2006" xmlns:r="http://schemas.openxmlformats.org/officeDocument/2006/relationships" xmlns:w="http://schemas.openxmlformats.org/wordprocessingml/2006/main" xmlns:w14="http://schemas.microsoft.com/office/word/2010/wordml" xmlns:w15="http://schemas.microsoft.com/office/word/2012/wordml" xmlns:w16cex="http://schemas.microsoft.com/office/word/2018/wordml/cex" xmlns:w16cid="http://schemas.microsoft.com/office/word/2016/wordml/cid" xmlns:w16="http://schemas.microsoft.com/office/word/2018/wordml" xmlns:w16du="http://schemas.microsoft.com/office/word/2023/wordml/word16du" xmlns:w16sdtdh="http://schemas.microsoft.com/office/word/2020/wordml/sdtdatahash" xmlns:w16sdtfl="http://schemas.microsoft.com/office/word/2024/wordml/sdtformatlock" xmlns:w16se="http://schemas.microsoft.com/office/word/2015/wordml/symex" mc:Ignorable="w14 w15 w16se w16cid w16 w16cex w16sdtdh w16sdtfl w16du">
+<w:styles xmlns:mc="http://schemas.openxmlformats.org/markup-compatibility/2006" xmlns:r="http://schemas.openxmlformats.org/officeDocument/2006/relationships" xmlns:w="http://schemas.openxmlformats.org/wordprocessingml/2006/main" xmlns:w14="http://schemas.microsoft.com/office/word/2010/wordml" xmlns:w15="http://schemas.microsoft.com/office/word/2012/wordml" xmlns:w16cex="http://schemas.microsoft.com/office/word/2018/wordml/cex" xmlns:w16cid="http://schemas.microsoft.com/office/word/2016/wordml/cid" xmlns:w16="http://schemas.microsoft.com/office/word/2018/wordml" xmlns:w16sdtdh="http://schemas.microsoft.com/office/word/2020/wordml/sdtdatahash" xmlns:w16se="http://schemas.microsoft.com/office/word/2015/wordml/symex" mc:Ignorable="w14 w15 w16se w16cid w16 w16cex w16sdtdh">
   <w:docDefaults>
     <w:rPrDefault>
       <w:rPr>
-        <w:rFonts w:asciiTheme="minorHAnsi" w:hAnsiTheme="minorHAnsi" w:eastAsiaTheme="minorHAnsi" w:cstheme="minorBidi"/>
+        <w:rFonts w:asciiTheme="minorHAnsi" w:eastAsiaTheme="minorHAnsi" w:hAnsiTheme="minorHAnsi" w:cstheme="minorBidi"/>
         <w:kern w:val="2"/>
         <w:sz w:val="22"/>
         <w:szCs w:val="22"/>
@@ -3156,14 +3077,14 @@
   <w:latentStyles w:defLockedState="0" w:defUIPriority="99" w:defSemiHidden="0" w:defUnhideWhenUsed="0" w:defQFormat="0" w:count="376">
     <w:lsdException w:name="Normal" w:uiPriority="0" w:qFormat="1"/>
     <w:lsdException w:name="heading 1" w:uiPriority="0" w:qFormat="1"/>
-    <w:lsdException w:name="heading 2" w:uiPriority="9" w:semiHidden="1" w:unhideWhenUsed="1" w:qFormat="1"/>
-    <w:lsdException w:name="heading 3" w:uiPriority="9" w:semiHidden="1" w:unhideWhenUsed="1" w:qFormat="1"/>
-    <w:lsdException w:name="heading 4" w:uiPriority="9" w:semiHidden="1" w:unhideWhenUsed="1" w:qFormat="1"/>
-    <w:lsdException w:name="heading 5" w:uiPriority="9" w:semiHidden="1" w:unhideWhenUsed="1" w:qFormat="1"/>
-    <w:lsdException w:name="heading 6" w:uiPriority="9" w:semiHidden="1" w:unhideWhenUsed="1" w:qFormat="1"/>
-    <w:lsdException w:name="heading 7" w:uiPriority="9" w:semiHidden="1" w:unhideWhenUsed="1" w:qFormat="1"/>
-    <w:lsdException w:name="heading 8" w:uiPriority="9" w:semiHidden="1" w:unhideWhenUsed="1" w:qFormat="1"/>
-    <w:lsdException w:name="heading 9" w:uiPriority="9" w:semiHidden="1" w:unhideWhenUsed="1" w:qFormat="1"/>
+    <w:lsdException w:name="heading 2" w:semiHidden="1" w:uiPriority="9" w:unhideWhenUsed="1" w:qFormat="1"/>
+    <w:lsdException w:name="heading 3" w:semiHidden="1" w:uiPriority="9" w:unhideWhenUsed="1" w:qFormat="1"/>
+    <w:lsdException w:name="heading 4" w:semiHidden="1" w:uiPriority="9" w:unhideWhenUsed="1" w:qFormat="1"/>
+    <w:lsdException w:name="heading 5" w:semiHidden="1" w:uiPriority="9" w:unhideWhenUsed="1" w:qFormat="1"/>
+    <w:lsdException w:name="heading 6" w:semiHidden="1" w:uiPriority="9" w:unhideWhenUsed="1" w:qFormat="1"/>
+    <w:lsdException w:name="heading 7" w:semiHidden="1" w:uiPriority="9" w:unhideWhenUsed="1" w:qFormat="1"/>
+    <w:lsdException w:name="heading 8" w:semiHidden="1" w:uiPriority="9" w:unhideWhenUsed="1" w:qFormat="1"/>
+    <w:lsdException w:name="heading 9" w:semiHidden="1" w:uiPriority="9" w:unhideWhenUsed="1" w:qFormat="1"/>
     <w:lsdException w:name="index 1" w:semiHidden="1" w:unhideWhenUsed="1"/>
     <w:lsdException w:name="index 2" w:semiHidden="1" w:unhideWhenUsed="1"/>
     <w:lsdException w:name="index 3" w:semiHidden="1" w:unhideWhenUsed="1"/>
@@ -3173,22 +3094,22 @@
     <w:lsdException w:name="index 7" w:semiHidden="1" w:unhideWhenUsed="1"/>
     <w:lsdException w:name="index 8" w:semiHidden="1" w:unhideWhenUsed="1"/>
     <w:lsdException w:name="index 9" w:semiHidden="1" w:unhideWhenUsed="1"/>
-    <w:lsdException w:name="toc 1" w:uiPriority="39" w:semiHidden="1" w:unhideWhenUsed="1"/>
-    <w:lsdException w:name="toc 2" w:uiPriority="39" w:semiHidden="1" w:unhideWhenUsed="1"/>
-    <w:lsdException w:name="toc 3" w:uiPriority="39" w:semiHidden="1" w:unhideWhenUsed="1"/>
-    <w:lsdException w:name="toc 4" w:uiPriority="39" w:semiHidden="1" w:unhideWhenUsed="1"/>
-    <w:lsdException w:name="toc 5" w:uiPriority="39" w:semiHidden="1" w:unhideWhenUsed="1"/>
-    <w:lsdException w:name="toc 6" w:uiPriority="39" w:semiHidden="1" w:unhideWhenUsed="1"/>
-    <w:lsdException w:name="toc 7" w:uiPriority="39" w:semiHidden="1" w:unhideWhenUsed="1"/>
-    <w:lsdException w:name="toc 8" w:uiPriority="39" w:semiHidden="1" w:unhideWhenUsed="1"/>
-    <w:lsdException w:name="toc 9" w:uiPriority="39" w:semiHidden="1" w:unhideWhenUsed="1"/>
+    <w:lsdException w:name="toc 1" w:semiHidden="1" w:uiPriority="39" w:unhideWhenUsed="1"/>
+    <w:lsdException w:name="toc 2" w:semiHidden="1" w:uiPriority="39" w:unhideWhenUsed="1"/>
+    <w:lsdException w:name="toc 3" w:semiHidden="1" w:uiPriority="39" w:unhideWhenUsed="1"/>
+    <w:lsdException w:name="toc 4" w:semiHidden="1" w:uiPriority="39" w:unhideWhenUsed="1"/>
+    <w:lsdException w:name="toc 5" w:semiHidden="1" w:uiPriority="39" w:unhideWhenUsed="1"/>
+    <w:lsdException w:name="toc 6" w:semiHidden="1" w:uiPriority="39" w:unhideWhenUsed="1"/>
+    <w:lsdException w:name="toc 7" w:semiHidden="1" w:uiPriority="39" w:unhideWhenUsed="1"/>
+    <w:lsdException w:name="toc 8" w:semiHidden="1" w:uiPriority="39" w:unhideWhenUsed="1"/>
+    <w:lsdException w:name="toc 9" w:semiHidden="1" w:uiPriority="39" w:unhideWhenUsed="1"/>
     <w:lsdException w:name="Normal Indent" w:semiHidden="1" w:unhideWhenUsed="1"/>
     <w:lsdException w:name="footnote text" w:semiHidden="1" w:unhideWhenUsed="1"/>
     <w:lsdException w:name="annotation text" w:semiHidden="1" w:unhideWhenUsed="1"/>
     <w:lsdException w:name="header" w:semiHidden="1" w:unhideWhenUsed="1"/>
     <w:lsdException w:name="footer" w:semiHidden="1" w:unhideWhenUsed="1"/>
     <w:lsdException w:name="index heading" w:semiHidden="1" w:unhideWhenUsed="1"/>
-    <w:lsdException w:name="caption" w:uiPriority="35" w:semiHidden="1" w:unhideWhenUsed="1" w:qFormat="1"/>
+    <w:lsdException w:name="caption" w:semiHidden="1" w:uiPriority="35" w:unhideWhenUsed="1" w:qFormat="1"/>
     <w:lsdException w:name="table of figures" w:semiHidden="1" w:unhideWhenUsed="1"/>
     <w:lsdException w:name="envelope address" w:semiHidden="1" w:unhideWhenUsed="1"/>
     <w:lsdException w:name="envelope return" w:semiHidden="1" w:unhideWhenUsed="1"/>
@@ -3219,8 +3140,8 @@
     <w:lsdException w:name="Title" w:uiPriority="0" w:qFormat="1"/>
     <w:lsdException w:name="Closing" w:semiHidden="1" w:unhideWhenUsed="1"/>
     <w:lsdException w:name="Signature" w:semiHidden="1" w:unhideWhenUsed="1"/>
-    <w:lsdException w:name="Default Paragraph Font" w:uiPriority="1" w:semiHidden="1" w:unhideWhenUsed="1"/>
-    <w:lsdException w:name="Body Text" w:uiPriority="0" w:semiHidden="1" w:unhideWhenUsed="1"/>
+    <w:lsdException w:name="Default Paragraph Font" w:semiHidden="1" w:uiPriority="1" w:unhideWhenUsed="1"/>
+    <w:lsdException w:name="Body Text" w:semiHidden="1" w:uiPriority="0" w:unhideWhenUsed="1"/>
     <w:lsdException w:name="Body Text Indent" w:semiHidden="1" w:unhideWhenUsed="1"/>
     <w:lsdException w:name="List Continue" w:semiHidden="1" w:unhideWhenUsed="1"/>
     <w:lsdException w:name="List Continue 2" w:semiHidden="1" w:unhideWhenUsed="1"/>
@@ -3248,7 +3169,7 @@
     <w:lsdException w:name="E-mail Signature" w:semiHidden="1" w:unhideWhenUsed="1"/>
     <w:lsdException w:name="HTML Top of Form" w:semiHidden="1" w:unhideWhenUsed="1"/>
     <w:lsdException w:name="HTML Bottom of Form" w:semiHidden="1" w:unhideWhenUsed="1"/>
-    <w:lsdException w:name="Normal (Web)" w:uiPriority="0" w:semiHidden="1" w:unhideWhenUsed="1"/>
+    <w:lsdException w:name="Normal (Web)" w:semiHidden="1" w:uiPriority="0" w:unhideWhenUsed="1"/>
     <w:lsdException w:name="HTML Acronym" w:semiHidden="1" w:unhideWhenUsed="1"/>
     <w:lsdException w:name="HTML Address" w:semiHidden="1" w:unhideWhenUsed="1"/>
     <w:lsdException w:name="HTML Cite" w:semiHidden="1" w:unhideWhenUsed="1"/>
@@ -3419,8 +3340,8 @@
     <w:lsdException w:name="Subtle Reference" w:uiPriority="31" w:qFormat="1"/>
     <w:lsdException w:name="Intense Reference" w:uiPriority="32" w:qFormat="1"/>
     <w:lsdException w:name="Book Title" w:uiPriority="33" w:qFormat="1"/>
-    <w:lsdException w:name="Bibliography" w:uiPriority="37" w:semiHidden="1" w:unhideWhenUsed="1"/>
-    <w:lsdException w:name="TOC Heading" w:uiPriority="39" w:semiHidden="1" w:unhideWhenUsed="1" w:qFormat="1"/>
+    <w:lsdException w:name="Bibliography" w:semiHidden="1" w:uiPriority="37" w:unhideWhenUsed="1"/>
+    <w:lsdException w:name="TOC Heading" w:semiHidden="1" w:uiPriority="39" w:unhideWhenUsed="1" w:qFormat="1"/>
     <w:lsdException w:name="Plain Table 1" w:uiPriority="41"/>
     <w:lsdException w:name="Plain Table 2" w:uiPriority="42"/>
     <w:lsdException w:name="Plain Table 3" w:uiPriority="43"/>
@@ -3531,12 +3452,12 @@
     <w:lsdException w:name="Unresolved Mention" w:semiHidden="1" w:unhideWhenUsed="1"/>
     <w:lsdException w:name="Smart Link" w:semiHidden="1" w:unhideWhenUsed="1"/>
   </w:latentStyles>
-  <w:style w:type="paragraph" w:styleId="Normal" w:default="1">
+  <w:style w:type="paragraph" w:default="1" w:styleId="Normal">
     <w:name w:val="Normal"/>
     <w:qFormat/>
     <w:rsid w:val="00FD52AD"/>
     <w:rPr>
-      <w:rFonts w:ascii="Times New Roman" w:hAnsi="Times New Roman" w:eastAsia="Times New Roman" w:cs="Times New Roman"/>
+      <w:rFonts w:ascii="Times New Roman" w:eastAsia="Times New Roman" w:hAnsi="Times New Roman" w:cs="Times New Roman"/>
       <w:kern w:val="0"/>
       <w:sz w:val="24"/>
       <w:szCs w:val="24"/>
@@ -3544,11 +3465,11 @@
       <w14:ligatures w14:val="none"/>
     </w:rPr>
   </w:style>
-  <w:style w:type="paragraph" w:styleId="Ttulo1">
+  <w:style w:type="paragraph" w:styleId="Heading1">
     <w:name w:val="heading 1"/>
     <w:basedOn w:val="Normal"/>
     <w:next w:val="Normal"/>
-    <w:link w:val="Ttulo1Car"/>
+    <w:link w:val="Heading1Char"/>
     <w:qFormat/>
     <w:rsid w:val="00FD52AD"/>
     <w:pPr>
@@ -3558,17 +3479,17 @@
       <w:outlineLvl w:val="0"/>
     </w:pPr>
     <w:rPr>
-      <w:rFonts w:asciiTheme="majorHAnsi" w:hAnsiTheme="majorHAnsi" w:eastAsiaTheme="majorEastAsia" w:cstheme="majorBidi"/>
+      <w:rFonts w:asciiTheme="majorHAnsi" w:eastAsiaTheme="majorEastAsia" w:hAnsiTheme="majorHAnsi" w:cstheme="majorBidi"/>
       <w:color w:val="0F4761" w:themeColor="accent1" w:themeShade="BF"/>
       <w:sz w:val="40"/>
       <w:szCs w:val="40"/>
     </w:rPr>
   </w:style>
-  <w:style w:type="paragraph" w:styleId="Ttulo2">
+  <w:style w:type="paragraph" w:styleId="Heading2">
     <w:name w:val="heading 2"/>
     <w:basedOn w:val="Normal"/>
     <w:next w:val="Normal"/>
-    <w:link w:val="Ttulo2Car"/>
+    <w:link w:val="Heading2Char"/>
     <w:uiPriority w:val="9"/>
     <w:semiHidden/>
     <w:unhideWhenUsed/>
@@ -3581,17 +3502,17 @@
       <w:outlineLvl w:val="1"/>
     </w:pPr>
     <w:rPr>
-      <w:rFonts w:asciiTheme="majorHAnsi" w:hAnsiTheme="majorHAnsi" w:eastAsiaTheme="majorEastAsia" w:cstheme="majorBidi"/>
+      <w:rFonts w:asciiTheme="majorHAnsi" w:eastAsiaTheme="majorEastAsia" w:hAnsiTheme="majorHAnsi" w:cstheme="majorBidi"/>
       <w:color w:val="0F4761" w:themeColor="accent1" w:themeShade="BF"/>
       <w:sz w:val="32"/>
       <w:szCs w:val="32"/>
     </w:rPr>
   </w:style>
-  <w:style w:type="paragraph" w:styleId="Ttulo3">
+  <w:style w:type="paragraph" w:styleId="Heading3">
     <w:name w:val="heading 3"/>
     <w:basedOn w:val="Normal"/>
     <w:next w:val="Normal"/>
-    <w:link w:val="Ttulo3Car"/>
+    <w:link w:val="Heading3Char"/>
     <w:uiPriority w:val="9"/>
     <w:semiHidden/>
     <w:unhideWhenUsed/>
@@ -3610,11 +3531,11 @@
       <w:szCs w:val="28"/>
     </w:rPr>
   </w:style>
-  <w:style w:type="paragraph" w:styleId="Ttulo4">
+  <w:style w:type="paragraph" w:styleId="Heading4">
     <w:name w:val="heading 4"/>
     <w:basedOn w:val="Normal"/>
     <w:next w:val="Normal"/>
-    <w:link w:val="Ttulo4Car"/>
+    <w:link w:val="Heading4Char"/>
     <w:uiPriority w:val="9"/>
     <w:semiHidden/>
     <w:unhideWhenUsed/>
@@ -3633,11 +3554,11 @@
       <w:color w:val="0F4761" w:themeColor="accent1" w:themeShade="BF"/>
     </w:rPr>
   </w:style>
-  <w:style w:type="paragraph" w:styleId="Ttulo5">
+  <w:style w:type="paragraph" w:styleId="Heading5">
     <w:name w:val="heading 5"/>
     <w:basedOn w:val="Normal"/>
     <w:next w:val="Normal"/>
-    <w:link w:val="Ttulo5Car"/>
+    <w:link w:val="Heading5Char"/>
     <w:uiPriority w:val="9"/>
     <w:semiHidden/>
     <w:unhideWhenUsed/>
@@ -3654,11 +3575,11 @@
       <w:color w:val="0F4761" w:themeColor="accent1" w:themeShade="BF"/>
     </w:rPr>
   </w:style>
-  <w:style w:type="paragraph" w:styleId="Ttulo6">
+  <w:style w:type="paragraph" w:styleId="Heading6">
     <w:name w:val="heading 6"/>
     <w:basedOn w:val="Normal"/>
     <w:next w:val="Normal"/>
-    <w:link w:val="Ttulo6Car"/>
+    <w:link w:val="Heading6Char"/>
     <w:uiPriority w:val="9"/>
     <w:semiHidden/>
     <w:unhideWhenUsed/>
@@ -3677,11 +3598,11 @@
       <w:color w:val="595959" w:themeColor="text1" w:themeTint="A6"/>
     </w:rPr>
   </w:style>
-  <w:style w:type="paragraph" w:styleId="Ttulo7">
+  <w:style w:type="paragraph" w:styleId="Heading7">
     <w:name w:val="heading 7"/>
     <w:basedOn w:val="Normal"/>
     <w:next w:val="Normal"/>
-    <w:link w:val="Ttulo7Car"/>
+    <w:link w:val="Heading7Char"/>
     <w:uiPriority w:val="9"/>
     <w:semiHidden/>
     <w:unhideWhenUsed/>
@@ -3698,11 +3619,11 @@
       <w:color w:val="595959" w:themeColor="text1" w:themeTint="A6"/>
     </w:rPr>
   </w:style>
-  <w:style w:type="paragraph" w:styleId="Ttulo8">
+  <w:style w:type="paragraph" w:styleId="Heading8">
     <w:name w:val="heading 8"/>
     <w:basedOn w:val="Normal"/>
     <w:next w:val="Normal"/>
-    <w:link w:val="Ttulo8Car"/>
+    <w:link w:val="Heading8Char"/>
     <w:uiPriority w:val="9"/>
     <w:semiHidden/>
     <w:unhideWhenUsed/>
@@ -3720,11 +3641,11 @@
       <w:color w:val="272727" w:themeColor="text1" w:themeTint="D8"/>
     </w:rPr>
   </w:style>
-  <w:style w:type="paragraph" w:styleId="Ttulo9">
+  <w:style w:type="paragraph" w:styleId="Heading9">
     <w:name w:val="heading 9"/>
     <w:basedOn w:val="Normal"/>
     <w:next w:val="Normal"/>
-    <w:link w:val="Ttulo9Car"/>
+    <w:link w:val="Heading9Char"/>
     <w:uiPriority w:val="9"/>
     <w:semiHidden/>
     <w:unhideWhenUsed/>
@@ -3740,13 +3661,13 @@
       <w:color w:val="272727" w:themeColor="text1" w:themeTint="D8"/>
     </w:rPr>
   </w:style>
-  <w:style w:type="character" w:styleId="Fuentedeprrafopredeter" w:default="1">
+  <w:style w:type="character" w:default="1" w:styleId="DefaultParagraphFont">
     <w:name w:val="Default Paragraph Font"/>
     <w:uiPriority w:val="1"/>
     <w:semiHidden/>
     <w:unhideWhenUsed/>
   </w:style>
-  <w:style w:type="table" w:styleId="Tablanormal" w:default="1">
+  <w:style w:type="table" w:default="1" w:styleId="TableNormal">
     <w:name w:val="Normal Table"/>
     <w:uiPriority w:val="99"/>
     <w:semiHidden/>
@@ -3761,42 +3682,42 @@
       </w:tblCellMar>
     </w:tblPr>
   </w:style>
-  <w:style w:type="numbering" w:styleId="Sinlista" w:default="1">
+  <w:style w:type="numbering" w:default="1" w:styleId="NoList">
     <w:name w:val="No List"/>
     <w:uiPriority w:val="99"/>
     <w:semiHidden/>
     <w:unhideWhenUsed/>
   </w:style>
-  <w:style w:type="character" w:styleId="Ttulo1Car" w:customStyle="1">
-    <w:name w:val="Título 1 Car"/>
-    <w:basedOn w:val="Fuentedeprrafopredeter"/>
-    <w:link w:val="Ttulo1"/>
+  <w:style w:type="character" w:customStyle="1" w:styleId="Heading1Char">
+    <w:name w:val="Heading 1 Char"/>
+    <w:basedOn w:val="DefaultParagraphFont"/>
+    <w:link w:val="Heading1"/>
     <w:rsid w:val="00FD52AD"/>
     <w:rPr>
-      <w:rFonts w:asciiTheme="majorHAnsi" w:hAnsiTheme="majorHAnsi" w:eastAsiaTheme="majorEastAsia" w:cstheme="majorBidi"/>
+      <w:rFonts w:asciiTheme="majorHAnsi" w:eastAsiaTheme="majorEastAsia" w:hAnsiTheme="majorHAnsi" w:cstheme="majorBidi"/>
       <w:color w:val="0F4761" w:themeColor="accent1" w:themeShade="BF"/>
       <w:sz w:val="40"/>
       <w:szCs w:val="40"/>
     </w:rPr>
   </w:style>
-  <w:style w:type="character" w:styleId="Ttulo2Car" w:customStyle="1">
-    <w:name w:val="Título 2 Car"/>
-    <w:basedOn w:val="Fuentedeprrafopredeter"/>
-    <w:link w:val="Ttulo2"/>
+  <w:style w:type="character" w:customStyle="1" w:styleId="Heading2Char">
+    <w:name w:val="Heading 2 Char"/>
+    <w:basedOn w:val="DefaultParagraphFont"/>
+    <w:link w:val="Heading2"/>
     <w:uiPriority w:val="9"/>
     <w:semiHidden/>
     <w:rsid w:val="00FD52AD"/>
     <w:rPr>
-      <w:rFonts w:asciiTheme="majorHAnsi" w:hAnsiTheme="majorHAnsi" w:eastAsiaTheme="majorEastAsia" w:cstheme="majorBidi"/>
+      <w:rFonts w:asciiTheme="majorHAnsi" w:eastAsiaTheme="majorEastAsia" w:hAnsiTheme="majorHAnsi" w:cstheme="majorBidi"/>
       <w:color w:val="0F4761" w:themeColor="accent1" w:themeShade="BF"/>
       <w:sz w:val="32"/>
       <w:szCs w:val="32"/>
     </w:rPr>
   </w:style>
-  <w:style w:type="character" w:styleId="Ttulo3Car" w:customStyle="1">
-    <w:name w:val="Título 3 Car"/>
-    <w:basedOn w:val="Fuentedeprrafopredeter"/>
-    <w:link w:val="Ttulo3"/>
+  <w:style w:type="character" w:customStyle="1" w:styleId="Heading3Char">
+    <w:name w:val="Heading 3 Char"/>
+    <w:basedOn w:val="DefaultParagraphFont"/>
+    <w:link w:val="Heading3"/>
     <w:uiPriority w:val="9"/>
     <w:semiHidden/>
     <w:rsid w:val="00FD52AD"/>
@@ -3807,10 +3728,10 @@
       <w:szCs w:val="28"/>
     </w:rPr>
   </w:style>
-  <w:style w:type="character" w:styleId="Ttulo4Car" w:customStyle="1">
-    <w:name w:val="Título 4 Car"/>
-    <w:basedOn w:val="Fuentedeprrafopredeter"/>
-    <w:link w:val="Ttulo4"/>
+  <w:style w:type="character" w:customStyle="1" w:styleId="Heading4Char">
+    <w:name w:val="Heading 4 Char"/>
+    <w:basedOn w:val="DefaultParagraphFont"/>
+    <w:link w:val="Heading4"/>
     <w:uiPriority w:val="9"/>
     <w:semiHidden/>
     <w:rsid w:val="00FD52AD"/>
@@ -3821,10 +3742,10 @@
       <w:color w:val="0F4761" w:themeColor="accent1" w:themeShade="BF"/>
     </w:rPr>
   </w:style>
-  <w:style w:type="character" w:styleId="Ttulo5Car" w:customStyle="1">
-    <w:name w:val="Título 5 Car"/>
-    <w:basedOn w:val="Fuentedeprrafopredeter"/>
-    <w:link w:val="Ttulo5"/>
+  <w:style w:type="character" w:customStyle="1" w:styleId="Heading5Char">
+    <w:name w:val="Heading 5 Char"/>
+    <w:basedOn w:val="DefaultParagraphFont"/>
+    <w:link w:val="Heading5"/>
     <w:uiPriority w:val="9"/>
     <w:semiHidden/>
     <w:rsid w:val="00FD52AD"/>
@@ -3833,10 +3754,10 @@
       <w:color w:val="0F4761" w:themeColor="accent1" w:themeShade="BF"/>
     </w:rPr>
   </w:style>
-  <w:style w:type="character" w:styleId="Ttulo6Car" w:customStyle="1">
-    <w:name w:val="Título 6 Car"/>
-    <w:basedOn w:val="Fuentedeprrafopredeter"/>
-    <w:link w:val="Ttulo6"/>
+  <w:style w:type="character" w:customStyle="1" w:styleId="Heading6Char">
+    <w:name w:val="Heading 6 Char"/>
+    <w:basedOn w:val="DefaultParagraphFont"/>
+    <w:link w:val="Heading6"/>
     <w:uiPriority w:val="9"/>
     <w:semiHidden/>
     <w:rsid w:val="00FD52AD"/>
@@ -3847,10 +3768,10 @@
       <w:color w:val="595959" w:themeColor="text1" w:themeTint="A6"/>
     </w:rPr>
   </w:style>
-  <w:style w:type="character" w:styleId="Ttulo7Car" w:customStyle="1">
-    <w:name w:val="Título 7 Car"/>
-    <w:basedOn w:val="Fuentedeprrafopredeter"/>
-    <w:link w:val="Ttulo7"/>
+  <w:style w:type="character" w:customStyle="1" w:styleId="Heading7Char">
+    <w:name w:val="Heading 7 Char"/>
+    <w:basedOn w:val="DefaultParagraphFont"/>
+    <w:link w:val="Heading7"/>
     <w:uiPriority w:val="9"/>
     <w:semiHidden/>
     <w:rsid w:val="00FD52AD"/>
@@ -3859,10 +3780,10 @@
       <w:color w:val="595959" w:themeColor="text1" w:themeTint="A6"/>
     </w:rPr>
   </w:style>
-  <w:style w:type="character" w:styleId="Ttulo8Car" w:customStyle="1">
-    <w:name w:val="Título 8 Car"/>
-    <w:basedOn w:val="Fuentedeprrafopredeter"/>
-    <w:link w:val="Ttulo8"/>
+  <w:style w:type="character" w:customStyle="1" w:styleId="Heading8Char">
+    <w:name w:val="Heading 8 Char"/>
+    <w:basedOn w:val="DefaultParagraphFont"/>
+    <w:link w:val="Heading8"/>
     <w:uiPriority w:val="9"/>
     <w:semiHidden/>
     <w:rsid w:val="00FD52AD"/>
@@ -3873,10 +3794,10 @@
       <w:color w:val="272727" w:themeColor="text1" w:themeTint="D8"/>
     </w:rPr>
   </w:style>
-  <w:style w:type="character" w:styleId="Ttulo9Car" w:customStyle="1">
-    <w:name w:val="Título 9 Car"/>
-    <w:basedOn w:val="Fuentedeprrafopredeter"/>
-    <w:link w:val="Ttulo9"/>
+  <w:style w:type="character" w:customStyle="1" w:styleId="Heading9Char">
+    <w:name w:val="Heading 9 Char"/>
+    <w:basedOn w:val="DefaultParagraphFont"/>
+    <w:link w:val="Heading9"/>
     <w:uiPriority w:val="9"/>
     <w:semiHidden/>
     <w:rsid w:val="00FD52AD"/>
@@ -3885,11 +3806,11 @@
       <w:color w:val="272727" w:themeColor="text1" w:themeTint="D8"/>
     </w:rPr>
   </w:style>
-  <w:style w:type="paragraph" w:styleId="Ttulo">
+  <w:style w:type="paragraph" w:styleId="Title">
     <w:name w:val="Title"/>
     <w:basedOn w:val="Normal"/>
     <w:next w:val="Normal"/>
-    <w:link w:val="TtuloCar"/>
+    <w:link w:val="TitleChar"/>
     <w:qFormat/>
     <w:rsid w:val="00FD52AD"/>
     <w:pPr>
@@ -3897,31 +3818,31 @@
       <w:contextualSpacing/>
     </w:pPr>
     <w:rPr>
-      <w:rFonts w:asciiTheme="majorHAnsi" w:hAnsiTheme="majorHAnsi" w:eastAsiaTheme="majorEastAsia" w:cstheme="majorBidi"/>
+      <w:rFonts w:asciiTheme="majorHAnsi" w:eastAsiaTheme="majorEastAsia" w:hAnsiTheme="majorHAnsi" w:cstheme="majorBidi"/>
       <w:spacing w:val="-10"/>
       <w:kern w:val="28"/>
       <w:sz w:val="56"/>
       <w:szCs w:val="56"/>
     </w:rPr>
   </w:style>
-  <w:style w:type="character" w:styleId="TtuloCar" w:customStyle="1">
-    <w:name w:val="Título Car"/>
-    <w:basedOn w:val="Fuentedeprrafopredeter"/>
-    <w:link w:val="Ttulo"/>
+  <w:style w:type="character" w:customStyle="1" w:styleId="TitleChar">
+    <w:name w:val="Title Char"/>
+    <w:basedOn w:val="DefaultParagraphFont"/>
+    <w:link w:val="Title"/>
     <w:rsid w:val="00FD52AD"/>
     <w:rPr>
-      <w:rFonts w:asciiTheme="majorHAnsi" w:hAnsiTheme="majorHAnsi" w:eastAsiaTheme="majorEastAsia" w:cstheme="majorBidi"/>
+      <w:rFonts w:asciiTheme="majorHAnsi" w:eastAsiaTheme="majorEastAsia" w:hAnsiTheme="majorHAnsi" w:cstheme="majorBidi"/>
       <w:spacing w:val="-10"/>
       <w:kern w:val="28"/>
       <w:sz w:val="56"/>
       <w:szCs w:val="56"/>
     </w:rPr>
   </w:style>
-  <w:style w:type="paragraph" w:styleId="Subttulo">
+  <w:style w:type="paragraph" w:styleId="Subtitle">
     <w:name w:val="Subtitle"/>
     <w:basedOn w:val="Normal"/>
     <w:next w:val="Normal"/>
-    <w:link w:val="SubttuloCar"/>
+    <w:link w:val="SubtitleChar"/>
     <w:uiPriority w:val="11"/>
     <w:qFormat/>
     <w:rsid w:val="00FD52AD"/>
@@ -3939,10 +3860,10 @@
       <w:szCs w:val="28"/>
     </w:rPr>
   </w:style>
-  <w:style w:type="character" w:styleId="SubttuloCar" w:customStyle="1">
-    <w:name w:val="Subtítulo Car"/>
-    <w:basedOn w:val="Fuentedeprrafopredeter"/>
-    <w:link w:val="Subttulo"/>
+  <w:style w:type="character" w:customStyle="1" w:styleId="SubtitleChar">
+    <w:name w:val="Subtitle Char"/>
+    <w:basedOn w:val="DefaultParagraphFont"/>
+    <w:link w:val="Subtitle"/>
     <w:uiPriority w:val="11"/>
     <w:rsid w:val="00FD52AD"/>
     <w:rPr>
@@ -3953,11 +3874,11 @@
       <w:szCs w:val="28"/>
     </w:rPr>
   </w:style>
-  <w:style w:type="paragraph" w:styleId="Cita">
+  <w:style w:type="paragraph" w:styleId="Quote">
     <w:name w:val="Quote"/>
     <w:basedOn w:val="Normal"/>
     <w:next w:val="Normal"/>
-    <w:link w:val="CitaCar"/>
+    <w:link w:val="QuoteChar"/>
     <w:uiPriority w:val="29"/>
     <w:qFormat/>
     <w:rsid w:val="00FD52AD"/>
@@ -3971,10 +3892,10 @@
       <w:color w:val="404040" w:themeColor="text1" w:themeTint="BF"/>
     </w:rPr>
   </w:style>
-  <w:style w:type="character" w:styleId="CitaCar" w:customStyle="1">
-    <w:name w:val="Cita Car"/>
-    <w:basedOn w:val="Fuentedeprrafopredeter"/>
-    <w:link w:val="Cita"/>
+  <w:style w:type="character" w:customStyle="1" w:styleId="QuoteChar">
+    <w:name w:val="Quote Char"/>
+    <w:basedOn w:val="DefaultParagraphFont"/>
+    <w:link w:val="Quote"/>
     <w:uiPriority w:val="29"/>
     <w:rsid w:val="00FD52AD"/>
     <w:rPr>
@@ -3983,7 +3904,7 @@
       <w:color w:val="404040" w:themeColor="text1" w:themeTint="BF"/>
     </w:rPr>
   </w:style>
-  <w:style w:type="paragraph" w:styleId="Prrafodelista">
+  <w:style w:type="paragraph" w:styleId="ListParagraph">
     <w:name w:val="List Paragraph"/>
     <w:basedOn w:val="Normal"/>
     <w:uiPriority w:val="34"/>
@@ -3994,9 +3915,9 @@
       <w:contextualSpacing/>
     </w:pPr>
   </w:style>
-  <w:style w:type="character" w:styleId="nfasisintenso">
+  <w:style w:type="character" w:styleId="IntenseEmphasis">
     <w:name w:val="Intense Emphasis"/>
-    <w:basedOn w:val="Fuentedeprrafopredeter"/>
+    <w:basedOn w:val="DefaultParagraphFont"/>
     <w:uiPriority w:val="21"/>
     <w:qFormat/>
     <w:rsid w:val="00FD52AD"/>
@@ -4006,18 +3927,18 @@
       <w:color w:val="0F4761" w:themeColor="accent1" w:themeShade="BF"/>
     </w:rPr>
   </w:style>
-  <w:style w:type="paragraph" w:styleId="Citadestacada">
+  <w:style w:type="paragraph" w:styleId="IntenseQuote">
     <w:name w:val="Intense Quote"/>
     <w:basedOn w:val="Normal"/>
     <w:next w:val="Normal"/>
-    <w:link w:val="CitadestacadaCar"/>
+    <w:link w:val="IntenseQuoteChar"/>
     <w:uiPriority w:val="30"/>
     <w:qFormat/>
     <w:rsid w:val="00FD52AD"/>
     <w:pPr>
       <w:pBdr>
-        <w:top w:val="single" w:color="0F4761" w:themeColor="accent1" w:themeShade="BF" w:sz="4" w:space="10"/>
-        <w:bottom w:val="single" w:color="0F4761" w:themeColor="accent1" w:themeShade="BF" w:sz="4" w:space="10"/>
+        <w:top w:val="single" w:sz="4" w:space="10" w:color="0F4761" w:themeColor="accent1" w:themeShade="BF"/>
+        <w:bottom w:val="single" w:sz="4" w:space="10" w:color="0F4761" w:themeColor="accent1" w:themeShade="BF"/>
       </w:pBdr>
       <w:spacing w:before="360" w:after="360"/>
       <w:ind w:left="864" w:right="864"/>
@@ -4029,10 +3950,10 @@
       <w:color w:val="0F4761" w:themeColor="accent1" w:themeShade="BF"/>
     </w:rPr>
   </w:style>
-  <w:style w:type="character" w:styleId="CitadestacadaCar" w:customStyle="1">
-    <w:name w:val="Cita destacada Car"/>
-    <w:basedOn w:val="Fuentedeprrafopredeter"/>
-    <w:link w:val="Citadestacada"/>
+  <w:style w:type="character" w:customStyle="1" w:styleId="IntenseQuoteChar">
+    <w:name w:val="Intense Quote Char"/>
+    <w:basedOn w:val="DefaultParagraphFont"/>
+    <w:link w:val="IntenseQuote"/>
     <w:uiPriority w:val="30"/>
     <w:rsid w:val="00FD52AD"/>
     <w:rPr>
@@ -4041,9 +3962,9 @@
       <w:color w:val="0F4761" w:themeColor="accent1" w:themeShade="BF"/>
     </w:rPr>
   </w:style>
-  <w:style w:type="character" w:styleId="Referenciaintensa">
+  <w:style w:type="character" w:styleId="IntenseReference">
     <w:name w:val="Intense Reference"/>
-    <w:basedOn w:val="Fuentedeprrafopredeter"/>
+    <w:basedOn w:val="DefaultParagraphFont"/>
     <w:uiPriority w:val="32"/>
     <w:qFormat/>
     <w:rsid w:val="00FD52AD"/>
@@ -4063,9 +3984,9 @@
       <w:spacing w:before="100" w:beforeAutospacing="1" w:after="100" w:afterAutospacing="1"/>
     </w:pPr>
   </w:style>
-  <w:style w:type="paragraph" w:styleId="ByLine" w:customStyle="1">
+  <w:style w:type="paragraph" w:customStyle="1" w:styleId="ByLine">
     <w:name w:val="ByLine"/>
-    <w:basedOn w:val="Ttulo"/>
+    <w:basedOn w:val="Title"/>
     <w:rsid w:val="00FD52AD"/>
     <w:pPr>
       <w:spacing w:before="240" w:after="720"/>
@@ -4073,7 +3994,7 @@
       <w:jc w:val="right"/>
     </w:pPr>
     <w:rPr>
-      <w:rFonts w:ascii="Arial" w:hAnsi="Arial" w:eastAsia="Times New Roman" w:cs="Times New Roman"/>
+      <w:rFonts w:ascii="Arial" w:eastAsia="Times New Roman" w:hAnsi="Arial" w:cs="Times New Roman"/>
       <w:b/>
       <w:spacing w:val="0"/>
       <w:sz w:val="28"/>
@@ -4081,7 +4002,7 @@
       <w:lang w:val="en-US"/>
     </w:rPr>
   </w:style>
-  <w:style w:type="paragraph" w:styleId="ChangeHistoryTitle" w:customStyle="1">
+  <w:style w:type="paragraph" w:customStyle="1" w:styleId="ChangeHistoryTitle">
     <w:name w:val="ChangeHistory Title"/>
     <w:basedOn w:val="Normal"/>
     <w:rsid w:val="00FD52AD"/>
@@ -4098,22 +4019,22 @@
       <w:lang w:val="en-US" w:eastAsia="en-US"/>
     </w:rPr>
   </w:style>
-  <w:style w:type="paragraph" w:styleId="Textoindependiente">
+  <w:style w:type="paragraph" w:styleId="BodyText">
     <w:name w:val="Body Text"/>
     <w:basedOn w:val="Normal"/>
-    <w:link w:val="TextoindependienteCar"/>
+    <w:link w:val="BodyTextChar"/>
     <w:rsid w:val="00FD52AD"/>
     <w:pPr>
       <w:spacing w:after="120"/>
     </w:pPr>
   </w:style>
-  <w:style w:type="character" w:styleId="TextoindependienteCar" w:customStyle="1">
-    <w:name w:val="Texto independiente Car"/>
-    <w:basedOn w:val="Fuentedeprrafopredeter"/>
-    <w:link w:val="Textoindependiente"/>
+  <w:style w:type="character" w:customStyle="1" w:styleId="BodyTextChar">
+    <w:name w:val="Body Text Char"/>
+    <w:basedOn w:val="DefaultParagraphFont"/>
+    <w:link w:val="BodyText"/>
     <w:rsid w:val="00FD52AD"/>
     <w:rPr>
-      <w:rFonts w:ascii="Times New Roman" w:hAnsi="Times New Roman" w:eastAsia="Times New Roman" w:cs="Times New Roman"/>
+      <w:rFonts w:ascii="Times New Roman" w:eastAsia="Times New Roman" w:hAnsi="Times New Roman" w:cs="Times New Roman"/>
       <w:kern w:val="0"/>
       <w:sz w:val="24"/>
       <w:szCs w:val="24"/>
@@ -4125,7 +4046,7 @@
 </file>
 
 <file path=word/theme/theme1.xml><?xml version="1.0" encoding="utf-8"?>
-<a:theme xmlns:a="http://schemas.openxmlformats.org/drawingml/2006/main" xmlns:thm15="http://schemas.microsoft.com/office/thememl/2012/main" name="Tema de Office">
+<a:theme xmlns:a="http://schemas.openxmlformats.org/drawingml/2006/main" name="Tema de Office">
   <a:themeElements>
     <a:clrScheme name="Office">
       <a:dk1>

</xml_diff>